<commit_message>
modified:   "papers/APPLICATION AND OPTIMIZATION OF THE MIXTURE OF EXPERTS (MOE) ARCHITECTURE FOR VARIOUS TASKS/\320\237\321\200\320\270\320\274\320\265\320\275\320\265\320\275\320\270\320\265 \320\270 \320\276\320\277\321\202\320\270\320\274\320\270\320\267\320\260\321\206\320\270\321\217 \320\260\321\200\321\205\320\270\321\202\320\265\320\272\321\202\321\203\321\200\321\213 Mixture of Experts (MoE) \320\264\320\273\321\217 \321\200\320\260\320\267\320\273\320\270\321\207\320\275\321\213\321\205 \320\267\320\260\320\264\320\260\321\207..docx"
</commit_message>
<xml_diff>
--- a/papers/APPLICATION AND OPTIMIZATION OF THE MIXTURE OF EXPERTS (MOE) ARCHITECTURE FOR VARIOUS TASKS/Применение и оптимизация архитектуры Mixture of Experts (MoE) для различных задач..docx
+++ b/papers/APPLICATION AND OPTIMIZATION OF THE MIXTURE OF EXPERTS (MOE) ARCHITECTURE FOR VARIOUS TASKS/Применение и оптимизация архитектуры Mixture of Experts (MoE) для различных задач..docx
@@ -139,34 +139,14 @@
                 <w:lang w:val="ru-RU"/>
               </w:rPr>
             </w:pPr>
-            <w:proofErr w:type="spellStart"/>
             <w:r>
               <w:rPr>
                 <w:b/>
                 <w:sz w:val="20"/>
                 <w:szCs w:val="20"/>
               </w:rPr>
-              <w:t>Заголовок</w:t>
-            </w:r>
-            <w:proofErr w:type="spellEnd"/>
-            <w:r>
-              <w:rPr>
-                <w:b/>
-                <w:sz w:val="20"/>
-                <w:szCs w:val="20"/>
-              </w:rPr>
-              <w:t xml:space="preserve"> </w:t>
-            </w:r>
-            <w:proofErr w:type="spellStart"/>
-            <w:r>
-              <w:rPr>
-                <w:b/>
-                <w:sz w:val="20"/>
-                <w:szCs w:val="20"/>
-              </w:rPr>
-              <w:t>статьи</w:t>
-            </w:r>
-            <w:proofErr w:type="spellEnd"/>
+              <w:t>Заголовок статьи</w:t>
+            </w:r>
           </w:p>
         </w:tc>
         <w:tc>
@@ -277,7 +257,6 @@
                 <w:lang w:val="ru-RU"/>
               </w:rPr>
             </w:pPr>
-            <w:proofErr w:type="spellStart"/>
             <w:r>
               <w:rPr>
                 <w:b/>
@@ -286,7 +265,6 @@
               </w:rPr>
               <w:t>Секция</w:t>
             </w:r>
-            <w:proofErr w:type="spellEnd"/>
           </w:p>
         </w:tc>
         <w:tc>
@@ -318,77 +296,13 @@
                 <w:lang w:val="ru-RU"/>
               </w:rPr>
             </w:pPr>
-            <w:proofErr w:type="spellStart"/>
             <w:r>
               <w:rPr>
                 <w:b/>
                 <w:sz w:val="20"/>
                 <w:szCs w:val="20"/>
               </w:rPr>
-              <w:t>Форма</w:t>
-            </w:r>
-            <w:proofErr w:type="spellEnd"/>
-            <w:r>
-              <w:rPr>
-                <w:b/>
-                <w:sz w:val="20"/>
-                <w:szCs w:val="20"/>
-              </w:rPr>
-              <w:t xml:space="preserve"> </w:t>
-            </w:r>
-            <w:proofErr w:type="spellStart"/>
-            <w:r>
-              <w:rPr>
-                <w:b/>
-                <w:sz w:val="20"/>
-                <w:szCs w:val="20"/>
-              </w:rPr>
-              <w:t>участия</w:t>
-            </w:r>
-            <w:proofErr w:type="spellEnd"/>
-            <w:r>
-              <w:rPr>
-                <w:b/>
-                <w:sz w:val="20"/>
-                <w:szCs w:val="20"/>
-              </w:rPr>
-              <w:t xml:space="preserve"> (</w:t>
-            </w:r>
-            <w:proofErr w:type="spellStart"/>
-            <w:r>
-              <w:rPr>
-                <w:b/>
-                <w:sz w:val="20"/>
-                <w:szCs w:val="20"/>
-              </w:rPr>
-              <w:t>очная</w:t>
-            </w:r>
-            <w:proofErr w:type="spellEnd"/>
-            <w:r>
-              <w:rPr>
-                <w:b/>
-                <w:sz w:val="20"/>
-                <w:szCs w:val="20"/>
-              </w:rPr>
-              <w:t xml:space="preserve">, </w:t>
-            </w:r>
-            <w:proofErr w:type="spellStart"/>
-            <w:r>
-              <w:rPr>
-                <w:b/>
-                <w:sz w:val="20"/>
-                <w:szCs w:val="20"/>
-              </w:rPr>
-              <w:t>заочная</w:t>
-            </w:r>
-            <w:proofErr w:type="spellEnd"/>
-            <w:r>
-              <w:rPr>
-                <w:b/>
-                <w:sz w:val="20"/>
-                <w:szCs w:val="20"/>
-              </w:rPr>
-              <w:t>)</w:t>
+              <w:t>Форма участия (очная, заочная)</w:t>
             </w:r>
           </w:p>
         </w:tc>
@@ -431,52 +345,14 @@
                 <w:lang w:val="ru-RU"/>
               </w:rPr>
             </w:pPr>
-            <w:proofErr w:type="spellStart"/>
             <w:r>
               <w:rPr>
                 <w:b/>
                 <w:sz w:val="20"/>
                 <w:szCs w:val="20"/>
               </w:rPr>
-              <w:t>Требуется</w:t>
-            </w:r>
-            <w:proofErr w:type="spellEnd"/>
-            <w:r>
-              <w:rPr>
-                <w:b/>
-                <w:sz w:val="20"/>
-                <w:szCs w:val="20"/>
-              </w:rPr>
-              <w:t xml:space="preserve"> </w:t>
-            </w:r>
-            <w:proofErr w:type="spellStart"/>
-            <w:r>
-              <w:rPr>
-                <w:b/>
-                <w:sz w:val="20"/>
-                <w:szCs w:val="20"/>
-              </w:rPr>
-              <w:t>сертификат</w:t>
-            </w:r>
-            <w:proofErr w:type="spellEnd"/>
-            <w:r>
-              <w:rPr>
-                <w:b/>
-                <w:sz w:val="20"/>
-                <w:szCs w:val="20"/>
-              </w:rPr>
-              <w:t xml:space="preserve"> </w:t>
-            </w:r>
-            <w:proofErr w:type="spellStart"/>
-            <w:r>
-              <w:rPr>
-                <w:b/>
-                <w:sz w:val="20"/>
-                <w:szCs w:val="20"/>
-              </w:rPr>
-              <w:t>участника</w:t>
-            </w:r>
-            <w:proofErr w:type="spellEnd"/>
+              <w:t>Требуется сертификат участника</w:t>
+            </w:r>
           </w:p>
         </w:tc>
         <w:tc>
@@ -492,7 +368,6 @@
                 <w:lang w:val="ru-RU"/>
               </w:rPr>
             </w:pPr>
-            <w:proofErr w:type="spellStart"/>
             <w:r>
               <w:rPr>
                 <w:b/>
@@ -501,25 +376,14 @@
               </w:rPr>
               <w:t>да</w:t>
             </w:r>
-            <w:proofErr w:type="spellEnd"/>
             <w:r>
               <w:rPr>
                 <w:bCs/>
                 <w:sz w:val="20"/>
                 <w:szCs w:val="20"/>
               </w:rPr>
-              <w:t>/</w:t>
-            </w:r>
-            <w:proofErr w:type="spellStart"/>
-            <w:r>
-              <w:rPr>
-                <w:bCs/>
-                <w:sz w:val="20"/>
-                <w:szCs w:val="20"/>
-              </w:rPr>
-              <w:t>нет</w:t>
-            </w:r>
-            <w:proofErr w:type="spellEnd"/>
+              <w:t>/нет</w:t>
+            </w:r>
           </w:p>
         </w:tc>
       </w:tr>
@@ -561,7 +425,6 @@
                 <w:lang w:val="ru-RU"/>
               </w:rPr>
             </w:pPr>
-            <w:proofErr w:type="spellStart"/>
             <w:r>
               <w:rPr>
                 <w:b/>
@@ -570,25 +433,14 @@
               </w:rPr>
               <w:t>да</w:t>
             </w:r>
-            <w:proofErr w:type="spellEnd"/>
             <w:r>
               <w:rPr>
                 <w:bCs/>
                 <w:sz w:val="20"/>
                 <w:szCs w:val="20"/>
               </w:rPr>
-              <w:t>/</w:t>
-            </w:r>
-            <w:proofErr w:type="spellStart"/>
-            <w:r>
-              <w:rPr>
-                <w:bCs/>
-                <w:sz w:val="20"/>
-                <w:szCs w:val="20"/>
-              </w:rPr>
-              <w:t>нет</w:t>
-            </w:r>
-            <w:proofErr w:type="spellEnd"/>
+              <w:t>/нет</w:t>
+            </w:r>
           </w:p>
         </w:tc>
       </w:tr>
@@ -606,52 +458,14 @@
                 <w:lang w:val="ru-RU"/>
               </w:rPr>
             </w:pPr>
-            <w:proofErr w:type="spellStart"/>
             <w:r>
               <w:rPr>
                 <w:b/>
                 <w:sz w:val="20"/>
                 <w:szCs w:val="20"/>
               </w:rPr>
-              <w:t>Учебное</w:t>
-            </w:r>
-            <w:proofErr w:type="spellEnd"/>
-            <w:r>
-              <w:rPr>
-                <w:b/>
-                <w:sz w:val="20"/>
-                <w:szCs w:val="20"/>
-              </w:rPr>
-              <w:t xml:space="preserve"> </w:t>
-            </w:r>
-            <w:proofErr w:type="spellStart"/>
-            <w:r>
-              <w:rPr>
-                <w:b/>
-                <w:sz w:val="20"/>
-                <w:szCs w:val="20"/>
-              </w:rPr>
-              <w:t>заведение</w:t>
-            </w:r>
-            <w:proofErr w:type="spellEnd"/>
-            <w:r>
-              <w:rPr>
-                <w:b/>
-                <w:sz w:val="20"/>
-                <w:szCs w:val="20"/>
-              </w:rPr>
-              <w:t xml:space="preserve">, </w:t>
-            </w:r>
-            <w:proofErr w:type="spellStart"/>
-            <w:r>
-              <w:rPr>
-                <w:b/>
-                <w:sz w:val="20"/>
-                <w:szCs w:val="20"/>
-              </w:rPr>
-              <w:t>организация</w:t>
-            </w:r>
-            <w:proofErr w:type="spellEnd"/>
+              <w:t>Учебное заведение, организация</w:t>
+            </w:r>
           </w:p>
         </w:tc>
         <w:tc>
@@ -742,7 +556,6 @@
                 <w:lang w:val="ru-RU"/>
               </w:rPr>
             </w:pPr>
-            <w:proofErr w:type="spellStart"/>
             <w:r>
               <w:rPr>
                 <w:b/>
@@ -751,7 +564,6 @@
               </w:rPr>
               <w:t>Телефон</w:t>
             </w:r>
-            <w:proofErr w:type="spellEnd"/>
           </w:p>
         </w:tc>
         <w:tc>
@@ -793,34 +605,14 @@
                 <w:lang w:val="ru-RU"/>
               </w:rPr>
             </w:pPr>
-            <w:proofErr w:type="spellStart"/>
             <w:r>
               <w:rPr>
                 <w:b/>
                 <w:sz w:val="20"/>
                 <w:szCs w:val="20"/>
               </w:rPr>
-              <w:t>Электронная</w:t>
-            </w:r>
-            <w:proofErr w:type="spellEnd"/>
-            <w:r>
-              <w:rPr>
-                <w:b/>
-                <w:sz w:val="20"/>
-                <w:szCs w:val="20"/>
-              </w:rPr>
-              <w:t xml:space="preserve"> </w:t>
-            </w:r>
-            <w:proofErr w:type="spellStart"/>
-            <w:r>
-              <w:rPr>
-                <w:b/>
-                <w:sz w:val="20"/>
-                <w:szCs w:val="20"/>
-              </w:rPr>
-              <w:t>почта</w:t>
-            </w:r>
-            <w:proofErr w:type="spellEnd"/>
+              <w:t>Электронная почта</w:t>
+            </w:r>
           </w:p>
         </w:tc>
         <w:tc>
@@ -860,34 +652,14 @@
                 <w:lang w:val="ru-RU"/>
               </w:rPr>
             </w:pPr>
-            <w:proofErr w:type="spellStart"/>
             <w:r>
               <w:rPr>
                 <w:b/>
                 <w:sz w:val="20"/>
                 <w:szCs w:val="20"/>
               </w:rPr>
-              <w:t>Почтовый</w:t>
-            </w:r>
-            <w:proofErr w:type="spellEnd"/>
-            <w:r>
-              <w:rPr>
-                <w:b/>
-                <w:sz w:val="20"/>
-                <w:szCs w:val="20"/>
-              </w:rPr>
-              <w:t xml:space="preserve"> </w:t>
-            </w:r>
-            <w:proofErr w:type="spellStart"/>
-            <w:r>
-              <w:rPr>
-                <w:b/>
-                <w:sz w:val="20"/>
-                <w:szCs w:val="20"/>
-              </w:rPr>
-              <w:t>адрес</w:t>
-            </w:r>
-            <w:proofErr w:type="spellEnd"/>
+              <w:t>Почтовый адрес</w:t>
+            </w:r>
           </w:p>
         </w:tc>
         <w:tc>
@@ -1349,14 +1121,12 @@
         <w:t xml:space="preserve"> </w:t>
       </w:r>
       <w:hyperlink r:id="rId10" w:history="1">
-        <w:proofErr w:type="spellStart"/>
         <w:r>
           <w:rPr>
             <w:rStyle w:val="a4"/>
           </w:rPr>
           <w:t>QuadDarv</w:t>
         </w:r>
-        <w:proofErr w:type="spellEnd"/>
         <w:r>
           <w:rPr>
             <w:rStyle w:val="a4"/>
@@ -1419,6 +1189,13 @@
     </w:p>
     <w:sdt>
       <w:sdtPr>
+        <w:rPr>
+          <w:rFonts w:ascii="Times New Roman" w:eastAsia="Arial" w:hAnsi="Times New Roman" w:cs="Times New Roman"/>
+          <w:color w:val="000000"/>
+          <w:sz w:val="28"/>
+          <w:szCs w:val="28"/>
+          <w:lang w:val="en-US"/>
+        </w:rPr>
         <w:id w:val="2085404408"/>
         <w:docPartObj>
           <w:docPartGallery w:val="Table of Contents"/>
@@ -1427,13 +1204,8 @@
       </w:sdtPr>
       <w:sdtEndPr>
         <w:rPr>
-          <w:rFonts w:ascii="Times New Roman" w:eastAsia="Arial" w:hAnsi="Times New Roman" w:cs="Times New Roman"/>
-          <w:b/>
-          <w:bCs/>
-          <w:color w:val="000000"/>
-          <w:sz w:val="28"/>
-          <w:szCs w:val="28"/>
-          <w:lang w:val="en-US"/>
+          <w:b/>
+          <w:bCs/>
         </w:rPr>
       </w:sdtEndPr>
       <w:sdtContent>
@@ -2145,7 +1917,8 @@
     </w:p>
     <w:p>
       <w:pPr>
-        <w:pStyle w:val="1"/>
+        <w:spacing w:after="0"/>
+        <w:ind w:firstLine="709"/>
         <w:rPr>
           <w:lang w:val="ru-RU"/>
         </w:rPr>
@@ -2154,6 +1927,396 @@
       <w:bookmarkStart w:id="3" w:name="_Toc216465008"/>
       <w:r>
         <w:rPr>
+          <w:b/>
+          <w:bCs/>
+          <w:lang w:val="ru-RU"/>
+        </w:rPr>
+        <w:lastRenderedPageBreak/>
+        <w:t>Аннотация</w:t>
+      </w:r>
+      <w:r>
+        <w:rPr>
+          <w:b/>
+          <w:bCs/>
+          <w:lang w:val="ru-RU"/>
+        </w:rPr>
+        <w:t xml:space="preserve">. </w:t>
+      </w:r>
+      <w:r>
+        <w:rPr>
+          <w:lang w:val="ru-RU"/>
+        </w:rPr>
+        <w:t xml:space="preserve">В работе рассматривается проблема повышения эффективности архитектур </w:t>
+      </w:r>
+      <w:r>
+        <w:t>Mixture</w:t>
+      </w:r>
+      <w:r>
+        <w:rPr>
+          <w:lang w:val="ru-RU"/>
+        </w:rPr>
+        <w:t xml:space="preserve"> </w:t>
+      </w:r>
+      <w:r>
+        <w:t>of</w:t>
+      </w:r>
+      <w:r>
+        <w:rPr>
+          <w:lang w:val="ru-RU"/>
+        </w:rPr>
+        <w:t xml:space="preserve"> </w:t>
+      </w:r>
+      <w:r>
+        <w:t>Experts</w:t>
+      </w:r>
+      <w:r>
+        <w:rPr>
+          <w:lang w:val="ru-RU"/>
+        </w:rPr>
+        <w:t xml:space="preserve"> (</w:t>
+      </w:r>
+      <w:r>
+        <w:t>MoE</w:t>
+      </w:r>
+      <w:r>
+        <w:rPr>
+          <w:lang w:val="ru-RU"/>
+        </w:rPr>
+        <w:t>) в задачах обработки естественного языка и компьютерного зрения при ограниченных вычислительных ресурсах.</w:t>
+      </w:r>
+    </w:p>
+    <w:p>
+      <w:pPr>
+        <w:spacing w:after="0"/>
+        <w:ind w:firstLine="709"/>
+        <w:rPr>
+          <w:lang w:val="ru-RU"/>
+        </w:rPr>
+      </w:pPr>
+      <w:r>
+        <w:rPr>
+          <w:lang w:val="ru-RU"/>
+        </w:rPr>
+        <w:t>На основе анализа существующих решений формулируются ключевые ограничения, связанные с роутингом экспертов, неравномерной балансировкой нагрузки и масштабируемостью моделей.</w:t>
+      </w:r>
+    </w:p>
+    <w:p>
+      <w:pPr>
+        <w:spacing w:after="0"/>
+        <w:ind w:firstLine="709"/>
+        <w:rPr>
+          <w:lang w:val="ru-RU"/>
+        </w:rPr>
+      </w:pPr>
+      <w:r>
+        <w:rPr>
+          <w:lang w:val="ru-RU"/>
+        </w:rPr>
+        <w:t xml:space="preserve">Предлагается гибридная </w:t>
+      </w:r>
+      <w:r>
+        <w:t>MoE</w:t>
+      </w:r>
+      <w:r>
+        <w:rPr>
+          <w:lang w:val="ru-RU"/>
+        </w:rPr>
+        <w:noBreakHyphen/>
+        <w:t>архитектура с доменно</w:t>
+      </w:r>
+      <w:r>
+        <w:rPr>
+          <w:lang w:val="ru-RU"/>
+        </w:rPr>
+        <w:noBreakHyphen/>
+        <w:t xml:space="preserve">специализированными экспертами для </w:t>
+      </w:r>
+      <w:r>
+        <w:t>NLP</w:t>
+      </w:r>
+      <w:r>
+        <w:rPr>
+          <w:lang w:val="ru-RU"/>
+        </w:rPr>
+        <w:t xml:space="preserve"> и </w:t>
+      </w:r>
+      <w:r>
+        <w:t>CV</w:t>
+      </w:r>
+      <w:r>
+        <w:rPr>
+          <w:lang w:val="ru-RU"/>
+        </w:rPr>
+        <w:t xml:space="preserve"> и модифицированным алгоритмом роутинга, учитывающим как тип входных данных, так и статистику загрузки.</w:t>
+      </w:r>
+    </w:p>
+    <w:p>
+      <w:pPr>
+        <w:spacing w:after="0"/>
+        <w:ind w:firstLine="709"/>
+        <w:rPr>
+          <w:lang w:val="ru-RU"/>
+        </w:rPr>
+      </w:pPr>
+      <w:r>
+        <w:rPr>
+          <w:lang w:val="ru-RU"/>
+        </w:rPr>
+        <w:t xml:space="preserve">Экспериментальная оценка на бенчмарках </w:t>
+      </w:r>
+      <w:r>
+        <w:t>GLUE</w:t>
+      </w:r>
+      <w:r>
+        <w:rPr>
+          <w:lang w:val="ru-RU"/>
+        </w:rPr>
+        <w:t xml:space="preserve"> и </w:t>
+      </w:r>
+      <w:r>
+        <w:t>ImageNet</w:t>
+      </w:r>
+      <w:r>
+        <w:rPr>
+          <w:lang w:val="ru-RU"/>
+        </w:rPr>
+        <w:t xml:space="preserve"> демонстрирует улучшение соотношения «качество–задержка» по сравнению с плотными моделями и базовыми реализациями </w:t>
+      </w:r>
+      <w:r>
+        <w:t>MoE</w:t>
+      </w:r>
+      <w:r>
+        <w:rPr>
+          <w:lang w:val="ru-RU"/>
+        </w:rPr>
+        <w:t xml:space="preserve"> при сопоставимом вычислительном бюджете.</w:t>
+      </w:r>
+    </w:p>
+    <w:p>
+      <w:pPr>
+        <w:spacing w:after="0"/>
+        <w:ind w:firstLine="709"/>
+        <w:rPr>
+          <w:lang w:val="ru-RU"/>
+        </w:rPr>
+      </w:pPr>
+      <w:r>
+        <w:rPr>
+          <w:lang w:val="ru-RU"/>
+        </w:rPr>
+        <w:t xml:space="preserve">Результаты </w:t>
+      </w:r>
+      <w:r>
+        <w:t>ablation</w:t>
+      </w:r>
+      <w:r>
+        <w:rPr>
+          <w:lang w:val="ru-RU"/>
+        </w:rPr>
+        <w:noBreakHyphen/>
+        <w:t xml:space="preserve">исследований подтверждают значимость балансировочных механизмов и специализации экспертов, а также позволяют выделить направления дальнейшего развития гибридных </w:t>
+      </w:r>
+      <w:r>
+        <w:t>MoE</w:t>
+      </w:r>
+      <w:r>
+        <w:rPr>
+          <w:lang w:val="ru-RU"/>
+        </w:rPr>
+        <w:noBreakHyphen/>
+        <w:t>архитектур в составе многоуровневых ИИ</w:t>
+      </w:r>
+      <w:r>
+        <w:rPr>
+          <w:lang w:val="ru-RU"/>
+        </w:rPr>
+        <w:noBreakHyphen/>
+        <w:t>систем.</w:t>
+      </w:r>
+    </w:p>
+    <w:p>
+      <w:pPr>
+        <w:spacing w:after="0"/>
+        <w:ind w:firstLine="709"/>
+        <w:rPr>
+          <w:lang w:val="ru-RU"/>
+        </w:rPr>
+      </w:pPr>
+    </w:p>
+    <w:p>
+      <w:pPr>
+        <w:spacing w:after="0"/>
+        <w:ind w:firstLine="709"/>
+        <w:rPr>
+          <w:lang w:val="ru-RU"/>
+        </w:rPr>
+      </w:pPr>
+      <w:r>
+        <w:rPr>
+          <w:b/>
+          <w:bCs/>
+          <w:lang w:val="ru-RU"/>
+        </w:rPr>
+        <w:t xml:space="preserve">Ключевые </w:t>
+      </w:r>
+      <w:r>
+        <w:rPr>
+          <w:b/>
+          <w:bCs/>
+          <w:lang w:val="ru-RU"/>
+        </w:rPr>
+        <w:t>слова</w:t>
+      </w:r>
+      <w:r>
+        <w:rPr>
+          <w:b/>
+          <w:bCs/>
+          <w:lang w:val="ru-RU"/>
+        </w:rPr>
+        <w:t xml:space="preserve">: </w:t>
+      </w:r>
+      <w:r>
+        <w:rPr>
+          <w:lang w:val="ru-RU"/>
+        </w:rPr>
+        <w:t>Mixture</w:t>
+      </w:r>
+      <w:r>
+        <w:rPr>
+          <w:lang w:val="ru-RU"/>
+        </w:rPr>
+        <w:t xml:space="preserve"> of Experts; MoE; гибридная архитектура; роутинг экспертов; балансировка нагрузки; разреженные модели; трансформеры; обработка естественного языка; компьютерное зрение; мультимодальные модели.</w:t>
+      </w:r>
+    </w:p>
+    <w:p/>
+    <w:p/>
+    <w:p/>
+    <w:p>
+      <w:pPr>
+        <w:spacing w:after="0"/>
+        <w:ind w:firstLine="709"/>
+      </w:pPr>
+      <w:r>
+        <w:rPr>
+          <w:b/>
+          <w:bCs/>
+        </w:rPr>
+        <w:lastRenderedPageBreak/>
+        <w:t>Abstract</w:t>
+      </w:r>
+      <w:r>
+        <w:rPr>
+          <w:b/>
+          <w:bCs/>
+        </w:rPr>
+        <w:t xml:space="preserve">. </w:t>
+      </w:r>
+      <w:r>
+        <w:t>This paper addresses the problem of improving the efficiency of Mixture of Experts (MoE) architectures for natural language processing and computer vision tasks under limited computational resources.</w:t>
+      </w:r>
+    </w:p>
+    <w:p>
+      <w:pPr>
+        <w:spacing w:after="0"/>
+        <w:ind w:firstLine="709"/>
+      </w:pPr>
+      <w:r>
+        <w:t>Based on an analysis of existing approaches, key limitations related to expert routing, load imbalance and model scalability are identified.</w:t>
+      </w:r>
+    </w:p>
+    <w:p>
+      <w:pPr>
+        <w:spacing w:after="0"/>
+        <w:ind w:firstLine="709"/>
+      </w:pPr>
+      <w:r>
+        <w:t>A hybrid MoE architecture is proposed that combines domain</w:t>
+      </w:r>
+      <w:r>
+        <w:noBreakHyphen/>
+        <w:t>specialized experts for NLP and CV with a modified routing algorithm that takes into account both the input modality and expert utilization statistics.</w:t>
+      </w:r>
+    </w:p>
+    <w:p>
+      <w:pPr>
+        <w:spacing w:after="0"/>
+        <w:ind w:firstLine="709"/>
+      </w:pPr>
+      <w:r>
+        <w:t>Experimental evaluation on the GLUE and ImageNet benchmarks demonstrates an improved accuracy–latency trade</w:t>
+      </w:r>
+      <w:r>
+        <w:noBreakHyphen/>
+        <w:t>off compared to dense baselines and conventional MoE models with a comparable computational budget.</w:t>
+      </w:r>
+    </w:p>
+    <w:p>
+      <w:pPr>
+        <w:spacing w:after="0"/>
+        <w:ind w:firstLine="709"/>
+      </w:pPr>
+      <w:r>
+        <w:t>Ablation studies confirm the importance of load</w:t>
+      </w:r>
+      <w:r>
+        <w:noBreakHyphen/>
+        <w:t>balancing mechanisms and expert specialization and outline promising directions for further development of hybrid MoE architectures within multi</w:t>
+      </w:r>
+      <w:r>
+        <w:noBreakHyphen/>
+        <w:t>layer AI systems.</w:t>
+      </w:r>
+    </w:p>
+    <w:p>
+      <w:pPr>
+        <w:spacing w:after="0"/>
+        <w:ind w:firstLine="709"/>
+      </w:pPr>
+    </w:p>
+    <w:p>
+      <w:pPr>
+        <w:spacing w:after="0"/>
+        <w:ind w:firstLine="709"/>
+      </w:pPr>
+      <w:r>
+        <w:rPr>
+          <w:b/>
+          <w:bCs/>
+        </w:rPr>
+        <w:t>Keywords</w:t>
+      </w:r>
+      <w:r>
+        <w:rPr>
+          <w:b/>
+          <w:bCs/>
+        </w:rPr>
+        <w:t xml:space="preserve">: </w:t>
+      </w:r>
+      <w:r>
+        <w:t>Mixture of Experts; MoE; hybrid architecture; expert routing; load balancing; sparse models; transformers; natural language processing; computer vision; multimodal models.</w:t>
+      </w:r>
+    </w:p>
+    <w:p>
+      <w:pPr>
+        <w:spacing w:line="278" w:lineRule="auto"/>
+        <w:jc w:val="left"/>
+        <w:rPr>
+          <w:rFonts w:eastAsia="Times New Roman"/>
+          <w:b/>
+          <w:bCs/>
+          <w:caps/>
+        </w:rPr>
+      </w:pPr>
+      <w:r>
+        <w:br w:type="page"/>
+      </w:r>
+    </w:p>
+    <w:p>
+      <w:pPr>
+        <w:pStyle w:val="1"/>
+      </w:pPr>
+      <w:r>
+        <w:rPr>
           <w:lang w:val="ru-RU"/>
         </w:rPr>
         <w:lastRenderedPageBreak/>
@@ -2166,9 +2329,6 @@
       <w:pPr>
         <w:spacing w:after="0"/>
         <w:ind w:firstLine="709"/>
-        <w:rPr>
-          <w:lang w:val="ru-RU"/>
-        </w:rPr>
       </w:pPr>
     </w:p>
     <w:p>
@@ -2232,7 +2392,6 @@
         </w:rPr>
         <w:t xml:space="preserve"> (</w:t>
       </w:r>
-      <w:proofErr w:type="spellStart"/>
       <w:r>
         <w:rPr>
           <w:b/>
@@ -2240,7 +2399,6 @@
         </w:rPr>
         <w:t>MoE</w:t>
       </w:r>
-      <w:proofErr w:type="spellEnd"/>
       <w:r>
         <w:rPr>
           <w:b/>
@@ -2278,11 +2436,9 @@
         </w:rPr>
         <w:t xml:space="preserve"> заключается в исследовании применения и оптимизации </w:t>
       </w:r>
-      <w:proofErr w:type="spellStart"/>
       <w:r>
         <w:t>MoE</w:t>
       </w:r>
-      <w:proofErr w:type="spellEnd"/>
       <w:r>
         <w:rPr>
           <w:lang w:val="ru-RU"/>
@@ -2312,30 +2468,14 @@
         </w:rPr>
         <w:t xml:space="preserve">, которую мы ставим перед собой, заключается в недостаточной эффективности существующих моделей </w:t>
       </w:r>
-      <w:proofErr w:type="spellStart"/>
       <w:r>
         <w:t>MoE</w:t>
       </w:r>
-      <w:proofErr w:type="spellEnd"/>
-      <w:r>
-        <w:rPr>
-          <w:lang w:val="ru-RU"/>
-        </w:rPr>
-        <w:t xml:space="preserve">, особенно в контексте </w:t>
-      </w:r>
-      <w:proofErr w:type="spellStart"/>
-      <w:r>
-        <w:rPr>
-          <w:lang w:val="ru-RU"/>
-        </w:rPr>
-        <w:t>роутинга</w:t>
-      </w:r>
-      <w:proofErr w:type="spellEnd"/>
-      <w:r>
-        <w:rPr>
-          <w:lang w:val="ru-RU"/>
-        </w:rPr>
-        <w:t xml:space="preserve"> экспертов и балансировки нагрузки, что требует системного анализа и разработки новых решений.</w:t>
+      <w:r>
+        <w:rPr>
+          <w:lang w:val="ru-RU"/>
+        </w:rPr>
+        <w:t>, особенно в контексте роутинга экспертов и балансировки нагрузки, что требует системного анализа и разработки новых решений.</w:t>
       </w:r>
     </w:p>
     <w:p>
@@ -2412,11 +2552,9 @@
         </w:rPr>
         <w:t xml:space="preserve">1) анализ существующих подходов и идентификация ключевых проблем в архитектуре </w:t>
       </w:r>
-      <w:proofErr w:type="spellStart"/>
       <w:r>
         <w:t>MoE</w:t>
       </w:r>
-      <w:proofErr w:type="spellEnd"/>
       <w:r>
         <w:rPr>
           <w:lang w:val="ru-RU"/>
@@ -2504,11 +2642,9 @@
         </w:rPr>
         <w:t xml:space="preserve"> включает теоретический обзор современных подходов к построению </w:t>
       </w:r>
-      <w:proofErr w:type="spellStart"/>
       <w:r>
         <w:t>MoE</w:t>
       </w:r>
-      <w:proofErr w:type="spellEnd"/>
       <w:r>
         <w:rPr>
           <w:lang w:val="ru-RU"/>
@@ -2548,11 +2684,9 @@
         </w:rPr>
         <w:t xml:space="preserve"> выступают современные реализации </w:t>
       </w:r>
-      <w:proofErr w:type="spellStart"/>
       <w:r>
         <w:t>MoE</w:t>
       </w:r>
-      <w:proofErr w:type="spellEnd"/>
       <w:r>
         <w:rPr>
           <w:lang w:val="ru-RU"/>
@@ -2571,21 +2705,7 @@
         <w:rPr>
           <w:lang w:val="ru-RU"/>
         </w:rPr>
-        <w:t xml:space="preserve">— методы архитектурной и алгоритмической оптимизации </w:t>
-      </w:r>
-      <w:proofErr w:type="spellStart"/>
-      <w:r>
-        <w:rPr>
-          <w:lang w:val="ru-RU"/>
-        </w:rPr>
-        <w:t>роутинга</w:t>
-      </w:r>
-      <w:proofErr w:type="spellEnd"/>
-      <w:r>
-        <w:rPr>
-          <w:lang w:val="ru-RU"/>
-        </w:rPr>
-        <w:t xml:space="preserve"> экспертов и распределения нагрузки.</w:t>
+        <w:t>— методы архитектурной и алгоритмической оптимизации роутинга экспертов и распределения нагрузки.</w:t>
       </w:r>
     </w:p>
     <w:p>
@@ -2642,11 +2762,9 @@
         </w:rPr>
         <w:t xml:space="preserve">Результаты исследования могут быть востребованы как в академической среде для дальнейшего развития </w:t>
       </w:r>
-      <w:proofErr w:type="spellStart"/>
       <w:r>
         <w:t>MoE</w:t>
       </w:r>
-      <w:proofErr w:type="spellEnd"/>
       <w:r>
         <w:rPr>
           <w:lang w:val="ru-RU"/>
@@ -2696,7 +2814,6 @@
         <w:ind w:firstLine="709"/>
         <w:rPr>
           <w:color w:val="auto"/>
-          <w:lang w:val="ru-RU"/>
         </w:rPr>
       </w:pPr>
       <w:bookmarkStart w:id="4" w:name="_Toc216465009"/>
@@ -2742,161 +2859,39 @@
       </w:r>
       <w:bookmarkEnd w:id="4"/>
     </w:p>
-    <w:p>
-      <w:pPr>
-        <w:rPr>
-          <w:lang w:val="ru-RU"/>
-        </w:rPr>
-      </w:pPr>
-    </w:p>
-    <w:p>
-      <w:pPr>
-        <w:spacing w:after="0"/>
-        <w:ind w:firstLine="709"/>
-        <w:rPr>
-          <w:b/>
-          <w:bCs/>
-          <w:lang w:val="ru-RU"/>
-        </w:rPr>
-      </w:pPr>
-      <w:r>
-        <w:rPr>
-          <w:b/>
-          <w:bCs/>
-          <w:lang w:val="ru-RU"/>
-        </w:rPr>
-        <w:t xml:space="preserve">1.1. Основные концепции и эволюция архитектур </w:t>
-      </w:r>
-      <w:proofErr w:type="spellStart"/>
-      <w:r>
-        <w:rPr>
-          <w:b/>
-          <w:bCs/>
-          <w:lang w:val="ru-RU"/>
-        </w:rPr>
-        <w:t>Mixture</w:t>
-      </w:r>
-      <w:proofErr w:type="spellEnd"/>
-      <w:r>
-        <w:rPr>
-          <w:b/>
-          <w:bCs/>
-          <w:lang w:val="ru-RU"/>
-        </w:rPr>
-        <w:t xml:space="preserve"> </w:t>
-      </w:r>
-      <w:proofErr w:type="spellStart"/>
-      <w:r>
-        <w:rPr>
-          <w:b/>
-          <w:bCs/>
-          <w:lang w:val="ru-RU"/>
-        </w:rPr>
-        <w:t>of</w:t>
-      </w:r>
-      <w:proofErr w:type="spellEnd"/>
-      <w:r>
-        <w:rPr>
-          <w:b/>
-          <w:bCs/>
-          <w:lang w:val="ru-RU"/>
-        </w:rPr>
-        <w:t xml:space="preserve"> </w:t>
-      </w:r>
-      <w:proofErr w:type="spellStart"/>
-      <w:r>
-        <w:rPr>
-          <w:b/>
-          <w:bCs/>
-          <w:lang w:val="ru-RU"/>
-        </w:rPr>
-        <w:t>Experts</w:t>
-      </w:r>
-      <w:proofErr w:type="spellEnd"/>
-    </w:p>
-    <w:p>
-      <w:pPr>
-        <w:spacing w:after="0"/>
-        <w:ind w:firstLine="709"/>
-        <w:rPr>
-          <w:lang w:val="ru-RU"/>
-        </w:rPr>
-      </w:pPr>
-      <w:r>
-        <w:rPr>
-          <w:lang w:val="ru-RU"/>
-        </w:rPr>
-        <w:t xml:space="preserve">Архитектура </w:t>
-      </w:r>
-      <w:proofErr w:type="spellStart"/>
-      <w:r>
-        <w:rPr>
-          <w:lang w:val="ru-RU"/>
-        </w:rPr>
-        <w:t>Mixture</w:t>
-      </w:r>
-      <w:proofErr w:type="spellEnd"/>
-      <w:r>
-        <w:rPr>
-          <w:lang w:val="ru-RU"/>
-        </w:rPr>
-        <w:t xml:space="preserve"> </w:t>
-      </w:r>
-      <w:proofErr w:type="spellStart"/>
-      <w:r>
-        <w:rPr>
-          <w:lang w:val="ru-RU"/>
-        </w:rPr>
-        <w:t>of</w:t>
-      </w:r>
-      <w:proofErr w:type="spellEnd"/>
-      <w:r>
-        <w:rPr>
-          <w:lang w:val="ru-RU"/>
-        </w:rPr>
-        <w:t xml:space="preserve"> </w:t>
-      </w:r>
-      <w:proofErr w:type="spellStart"/>
-      <w:r>
-        <w:rPr>
-          <w:lang w:val="ru-RU"/>
-        </w:rPr>
-        <w:t>Experts</w:t>
-      </w:r>
-      <w:proofErr w:type="spellEnd"/>
-      <w:r>
-        <w:rPr>
-          <w:lang w:val="ru-RU"/>
-        </w:rPr>
-        <w:t xml:space="preserve"> (</w:t>
-      </w:r>
-      <w:proofErr w:type="spellStart"/>
-      <w:r>
-        <w:rPr>
-          <w:lang w:val="ru-RU"/>
-        </w:rPr>
-        <w:t>MoE</w:t>
-      </w:r>
-      <w:proofErr w:type="spellEnd"/>
-      <w:r>
-        <w:rPr>
-          <w:lang w:val="ru-RU"/>
-        </w:rPr>
-        <w:t>) была предложена как способ разбиения сложной задачи на подзадачи, каждая из которых решается отдельным экспертом, а их выходы агрегируются с помощью управляющей (</w:t>
-      </w:r>
-      <w:proofErr w:type="spellStart"/>
-      <w:r>
-        <w:rPr>
-          <w:lang w:val="ru-RU"/>
-        </w:rPr>
-        <w:t>gating</w:t>
-      </w:r>
-      <w:proofErr w:type="spellEnd"/>
-      <w:r>
-        <w:rPr>
-          <w:lang w:val="ru-RU"/>
-        </w:rPr>
-        <w:t>) сети.</w:t>
+    <w:p/>
+    <w:p>
+      <w:pPr>
+        <w:spacing w:after="0"/>
+        <w:ind w:firstLine="709"/>
+        <w:rPr>
+          <w:b/>
+          <w:bCs/>
+          <w:lang w:val="ru-RU"/>
+        </w:rPr>
+      </w:pPr>
+      <w:r>
+        <w:rPr>
+          <w:b/>
+          <w:bCs/>
+          <w:lang w:val="ru-RU"/>
+        </w:rPr>
+        <w:t>1.1. Основные концепции и эволюция архитектур Mixture of Experts</w:t>
+      </w:r>
+    </w:p>
+    <w:p>
+      <w:pPr>
+        <w:spacing w:after="0"/>
+        <w:ind w:firstLine="709"/>
+        <w:rPr>
+          <w:lang w:val="ru-RU"/>
+        </w:rPr>
+      </w:pPr>
+      <w:r>
+        <w:rPr>
+          <w:lang w:val="ru-RU"/>
+        </w:rPr>
+        <w:t>Архитектура Mixture of Experts (MoE) была предложена как способ разбиения сложной задачи на подзадачи, каждая из которых решается отдельным экспертом, а их выходы агрегируются с помощью управляющей (gating) сети.</w:t>
       </w:r>
     </w:p>
     <w:p>
@@ -2926,79 +2921,37 @@
         <w:rPr>
           <w:lang w:val="ru-RU"/>
         </w:rPr>
-        <w:t xml:space="preserve">Ранние варианты </w:t>
-      </w:r>
-      <w:proofErr w:type="spellStart"/>
-      <w:r>
-        <w:rPr>
-          <w:lang w:val="ru-RU"/>
-        </w:rPr>
-        <w:t>MoE</w:t>
-      </w:r>
-      <w:proofErr w:type="spellEnd"/>
-      <w:r>
-        <w:rPr>
-          <w:lang w:val="ru-RU"/>
-        </w:rPr>
-        <w:t xml:space="preserve"> использовали плотную активацию нескольких экспертов одновременно, что обеспечивало высокую выразительную способность, но не решало проблему масштабирования.</w:t>
-      </w:r>
-    </w:p>
-    <w:p>
-      <w:pPr>
-        <w:spacing w:after="0"/>
-        <w:ind w:firstLine="709"/>
-        <w:rPr>
-          <w:lang w:val="ru-RU"/>
-        </w:rPr>
-      </w:pPr>
-      <w:r>
-        <w:rPr>
-          <w:lang w:val="ru-RU"/>
-        </w:rPr>
-        <w:t xml:space="preserve">С развитием глубокого обучения и ростом размеров моделей появились разреженные варианты </w:t>
-      </w:r>
-      <w:proofErr w:type="spellStart"/>
-      <w:r>
-        <w:rPr>
-          <w:lang w:val="ru-RU"/>
-        </w:rPr>
-        <w:t>MoE</w:t>
-      </w:r>
-      <w:proofErr w:type="spellEnd"/>
-      <w:r>
-        <w:rPr>
-          <w:lang w:val="ru-RU"/>
-        </w:rPr>
-        <w:t>, в которых для каждого входа активируется лишь малое подмножество экспертов, что позволило существенно увеличить суммарное число параметров без линейного роста вычислительных затрат.</w:t>
-      </w:r>
-    </w:p>
-    <w:p>
-      <w:pPr>
-        <w:spacing w:after="0"/>
-        <w:ind w:firstLine="709"/>
-        <w:rPr>
-          <w:lang w:val="ru-RU"/>
-        </w:rPr>
-      </w:pPr>
-      <w:r>
-        <w:rPr>
-          <w:lang w:val="ru-RU"/>
-        </w:rPr>
-        <w:t xml:space="preserve">Ключевым этапом эволюции стали архитектуры, интегрирующие </w:t>
-      </w:r>
-      <w:proofErr w:type="spellStart"/>
-      <w:r>
-        <w:rPr>
-          <w:lang w:val="ru-RU"/>
-        </w:rPr>
-        <w:t>MoE</w:t>
-      </w:r>
-      <w:proofErr w:type="spellEnd"/>
-      <w:r>
-        <w:rPr>
-          <w:lang w:val="ru-RU"/>
-        </w:rPr>
-        <w:t xml:space="preserve"> в трансформеры, в том числе для задач обработки естественного языка и компьютерного зрения.</w:t>
+        <w:t>Ранние варианты MoE использовали плотную активацию нескольких экспертов одновременно, что обеспечивало высокую выразительную способность, но не решало проблему масштабирования.</w:t>
+      </w:r>
+    </w:p>
+    <w:p>
+      <w:pPr>
+        <w:spacing w:after="0"/>
+        <w:ind w:firstLine="709"/>
+        <w:rPr>
+          <w:lang w:val="ru-RU"/>
+        </w:rPr>
+      </w:pPr>
+      <w:r>
+        <w:rPr>
+          <w:lang w:val="ru-RU"/>
+        </w:rPr>
+        <w:t>С развитием глубокого обучения и ростом размеров моделей появились разреженные варианты MoE, в которых для каждого входа активируется лишь малое подмножество экспертов, что позволило существенно увеличить суммарное число параметров без линейного роста вычислительных затрат.</w:t>
+      </w:r>
+    </w:p>
+    <w:p>
+      <w:pPr>
+        <w:spacing w:after="0"/>
+        <w:ind w:firstLine="709"/>
+        <w:rPr>
+          <w:lang w:val="ru-RU"/>
+        </w:rPr>
+      </w:pPr>
+      <w:r>
+        <w:rPr>
+          <w:lang w:val="ru-RU"/>
+        </w:rPr>
+        <w:t>Ключевым этапом эволюции стали архитектуры, интегрирующие MoE в трансформеры, в том числе для задач обработки естественного языка и компьютерного зрения.</w:t>
       </w:r>
     </w:p>
     <w:p>
@@ -3014,110 +2967,50 @@
           <w:lang w:val="ru-RU"/>
         </w:rPr>
         <w:lastRenderedPageBreak/>
-        <w:t xml:space="preserve">Переход к крупномасштабным моделям на распределённых вычислительных кластерах выдвинул новые требования к </w:t>
-      </w:r>
-      <w:proofErr w:type="spellStart"/>
-      <w:r>
-        <w:rPr>
-          <w:lang w:val="ru-RU"/>
-        </w:rPr>
-        <w:t>роутингу</w:t>
-      </w:r>
-      <w:proofErr w:type="spellEnd"/>
-      <w:r>
-        <w:rPr>
-          <w:lang w:val="ru-RU"/>
-        </w:rPr>
-        <w:t>, балансировке нагрузки и организации коммуникаций между устройствами, что привело к появлению специализированных механизмов маршрутизации и оптимизационных стратегий.</w:t>
-      </w:r>
-    </w:p>
-    <w:p>
-      <w:pPr>
-        <w:spacing w:after="0"/>
-        <w:ind w:firstLine="709"/>
-        <w:rPr>
-          <w:lang w:val="ru-RU"/>
-        </w:rPr>
-      </w:pPr>
-    </w:p>
-    <w:p>
-      <w:pPr>
-        <w:spacing w:after="0"/>
-        <w:ind w:firstLine="709"/>
-        <w:rPr>
-          <w:b/>
-          <w:bCs/>
-          <w:lang w:val="ru-RU"/>
-        </w:rPr>
-      </w:pPr>
-      <w:r>
-        <w:rPr>
-          <w:b/>
-          <w:bCs/>
-          <w:lang w:val="ru-RU"/>
-        </w:rPr>
-        <w:t xml:space="preserve">1.2. Классификация и обзор современных реализаций </w:t>
-      </w:r>
-      <w:proofErr w:type="spellStart"/>
-      <w:r>
-        <w:rPr>
-          <w:b/>
-          <w:bCs/>
-          <w:lang w:val="ru-RU"/>
-        </w:rPr>
-        <w:t>MoE</w:t>
-      </w:r>
-      <w:proofErr w:type="spellEnd"/>
-      <w:r>
-        <w:rPr>
-          <w:b/>
-          <w:bCs/>
-          <w:lang w:val="ru-RU"/>
-        </w:rPr>
-        <w:t xml:space="preserve"> в NLP и CV</w:t>
-      </w:r>
-    </w:p>
-    <w:p>
-      <w:pPr>
-        <w:spacing w:after="0"/>
-        <w:ind w:firstLine="709"/>
-        <w:rPr>
-          <w:lang w:val="ru-RU"/>
-        </w:rPr>
-      </w:pPr>
-      <w:r>
-        <w:rPr>
-          <w:lang w:val="ru-RU"/>
-        </w:rPr>
-        <w:t xml:space="preserve">Современные реализации </w:t>
-      </w:r>
-      <w:proofErr w:type="spellStart"/>
-      <w:r>
-        <w:rPr>
-          <w:lang w:val="ru-RU"/>
-        </w:rPr>
-        <w:t>MoE</w:t>
-      </w:r>
-      <w:proofErr w:type="spellEnd"/>
-      <w:r>
-        <w:rPr>
-          <w:lang w:val="ru-RU"/>
-        </w:rPr>
-        <w:t xml:space="preserve"> в задачах обработки естественного языка (NLP) можно условно разделить на несколько классов: модели с плоским роутером, иерархические </w:t>
-      </w:r>
-      <w:proofErr w:type="spellStart"/>
-      <w:r>
-        <w:rPr>
-          <w:lang w:val="ru-RU"/>
-        </w:rPr>
-        <w:t>MoE</w:t>
-      </w:r>
-      <w:proofErr w:type="spellEnd"/>
-      <w:r>
-        <w:rPr>
-          <w:lang w:val="ru-RU"/>
-        </w:rPr>
-        <w:t>, а также гибридные архитектуры, сочетающие плотные и разреженные слои.</w:t>
+        <w:t>Переход к крупномасштабным моделям на распределённых вычислительных кластерах выдвинул новые требования к роутингу, балансировке нагрузки и организации коммуникаций между устройствами, что привело к появлению специализированных механизмов маршрутизации и оптимизационных стратегий.</w:t>
+      </w:r>
+    </w:p>
+    <w:p>
+      <w:pPr>
+        <w:spacing w:after="0"/>
+        <w:ind w:firstLine="709"/>
+        <w:rPr>
+          <w:lang w:val="ru-RU"/>
+        </w:rPr>
+      </w:pPr>
+    </w:p>
+    <w:p>
+      <w:pPr>
+        <w:spacing w:after="0"/>
+        <w:ind w:firstLine="709"/>
+        <w:rPr>
+          <w:b/>
+          <w:bCs/>
+          <w:lang w:val="ru-RU"/>
+        </w:rPr>
+      </w:pPr>
+      <w:r>
+        <w:rPr>
+          <w:b/>
+          <w:bCs/>
+          <w:lang w:val="ru-RU"/>
+        </w:rPr>
+        <w:t>1.2. Классификация и обзор современных реализаций MoE в NLP и CV</w:t>
+      </w:r>
+    </w:p>
+    <w:p>
+      <w:pPr>
+        <w:spacing w:after="0"/>
+        <w:ind w:firstLine="709"/>
+        <w:rPr>
+          <w:lang w:val="ru-RU"/>
+        </w:rPr>
+      </w:pPr>
+      <w:r>
+        <w:rPr>
+          <w:lang w:val="ru-RU"/>
+        </w:rPr>
+        <w:t>Современные реализации MoE в задачах обработки естественного языка (NLP) можно условно разделить на несколько классов: модели с плоским роутером, иерархические MoE, а также гибридные архитектуры, сочетающие плотные и разреженные слои.</w:t>
       </w:r>
     </w:p>
     <w:p>
@@ -3147,115 +3040,51 @@
         <w:rPr>
           <w:lang w:val="ru-RU"/>
         </w:rPr>
-        <w:t xml:space="preserve">В NLP </w:t>
-      </w:r>
-      <w:proofErr w:type="spellStart"/>
-      <w:r>
-        <w:rPr>
-          <w:lang w:val="ru-RU"/>
-        </w:rPr>
-        <w:t>MoE</w:t>
-      </w:r>
-      <w:proofErr w:type="spellEnd"/>
+        <w:t>В NLP MoE</w:t>
+      </w:r>
       <w:r>
         <w:rPr>
           <w:lang w:val="ru-RU"/>
         </w:rPr>
         <w:noBreakHyphen/>
-        <w:t xml:space="preserve">слои часто встраиваются в блоки </w:t>
-      </w:r>
-      <w:proofErr w:type="spellStart"/>
-      <w:r>
-        <w:rPr>
-          <w:lang w:val="ru-RU"/>
-        </w:rPr>
-        <w:t>feed</w:t>
+        <w:t>слои часто встраиваются в блоки feed</w:t>
       </w:r>
       <w:r>
         <w:rPr>
           <w:lang w:val="ru-RU"/>
         </w:rPr>
         <w:noBreakHyphen/>
-        <w:t>forward</w:t>
-      </w:r>
-      <w:proofErr w:type="spellEnd"/>
-      <w:r>
-        <w:rPr>
-          <w:lang w:val="ru-RU"/>
-        </w:rPr>
-        <w:t xml:space="preserve"> трансформеров, где каждый эксперт представляет собой независимую проекцию с нелинейностью, а роутер определяет, какие эксперты должны обработать конкретный токен.</w:t>
-      </w:r>
-    </w:p>
-    <w:p>
-      <w:pPr>
-        <w:spacing w:after="0"/>
-        <w:ind w:firstLine="709"/>
-        <w:rPr>
-          <w:lang w:val="ru-RU"/>
-        </w:rPr>
-      </w:pPr>
-      <w:r>
-        <w:rPr>
-          <w:lang w:val="ru-RU"/>
-        </w:rPr>
-        <w:t xml:space="preserve">Это позволяет достичь высокой емкости модели и улучшения качества на бенчмарках при сохранении приемлемого времени </w:t>
-      </w:r>
-      <w:proofErr w:type="spellStart"/>
-      <w:r>
-        <w:rPr>
-          <w:lang w:val="ru-RU"/>
-        </w:rPr>
-        <w:t>инференса</w:t>
-      </w:r>
-      <w:proofErr w:type="spellEnd"/>
-      <w:r>
-        <w:rPr>
-          <w:lang w:val="ru-RU"/>
-        </w:rPr>
-        <w:t xml:space="preserve"> за счёт разреженной активации экспертов.</w:t>
-      </w:r>
-    </w:p>
-    <w:p>
-      <w:pPr>
-        <w:spacing w:after="0"/>
-        <w:ind w:firstLine="709"/>
-        <w:rPr>
-          <w:lang w:val="ru-RU"/>
-        </w:rPr>
-      </w:pPr>
-      <w:r>
-        <w:rPr>
-          <w:lang w:val="ru-RU"/>
-        </w:rPr>
-        <w:t xml:space="preserve">В компьютерном зрении (CV) архитектуры </w:t>
-      </w:r>
-      <w:proofErr w:type="spellStart"/>
-      <w:r>
-        <w:rPr>
-          <w:lang w:val="ru-RU"/>
-        </w:rPr>
-        <w:t>MoE</w:t>
-      </w:r>
-      <w:proofErr w:type="spellEnd"/>
-      <w:r>
-        <w:rPr>
-          <w:lang w:val="ru-RU"/>
-        </w:rPr>
-        <w:t xml:space="preserve"> применяются как в рамках </w:t>
-      </w:r>
-      <w:proofErr w:type="spellStart"/>
-      <w:r>
-        <w:rPr>
-          <w:lang w:val="ru-RU"/>
-        </w:rPr>
-        <w:t>сверточных</w:t>
-      </w:r>
-      <w:proofErr w:type="spellEnd"/>
-      <w:r>
-        <w:rPr>
-          <w:lang w:val="ru-RU"/>
-        </w:rPr>
-        <w:t xml:space="preserve"> сетей, так и в современных визуальных трансформерах.</w:t>
+        <w:t>forward трансформеров, где каждый эксперт представляет собой независимую проекцию с нелинейностью, а роутер определяет, какие эксперты должны обработать конкретный токен.</w:t>
+      </w:r>
+    </w:p>
+    <w:p>
+      <w:pPr>
+        <w:spacing w:after="0"/>
+        <w:ind w:firstLine="709"/>
+        <w:rPr>
+          <w:lang w:val="ru-RU"/>
+        </w:rPr>
+      </w:pPr>
+      <w:r>
+        <w:rPr>
+          <w:lang w:val="ru-RU"/>
+        </w:rPr>
+        <w:t>Это позволяет достичь высокой емкости модели и улучшения качества на бенчмарках при сохранении приемлемого времени инференса за счёт разреженной активации экспертов.</w:t>
+      </w:r>
+    </w:p>
+    <w:p>
+      <w:pPr>
+        <w:spacing w:after="0"/>
+        <w:ind w:firstLine="709"/>
+        <w:rPr>
+          <w:lang w:val="ru-RU"/>
+        </w:rPr>
+      </w:pPr>
+      <w:r>
+        <w:rPr>
+          <w:lang w:val="ru-RU"/>
+        </w:rPr>
+        <w:t>В компьютерном зрении (CV) архитектуры MoE применяются как в рамках сверточных сетей, так и в современных визуальных трансформерах.</w:t>
       </w:r>
     </w:p>
     <w:p>
@@ -3271,16 +3100,8 @@
           <w:lang w:val="ru-RU"/>
         </w:rPr>
         <w:lastRenderedPageBreak/>
-        <w:t xml:space="preserve">Визуальные </w:t>
-      </w:r>
-      <w:proofErr w:type="spellStart"/>
-      <w:r>
-        <w:rPr>
-          <w:lang w:val="ru-RU"/>
-        </w:rPr>
-        <w:t>MoE</w:t>
-      </w:r>
-      <w:proofErr w:type="spellEnd"/>
+        <w:t>Визуальные MoE</w:t>
+      </w:r>
       <w:r>
         <w:rPr>
           <w:lang w:val="ru-RU"/>
@@ -3301,160 +3122,72 @@
         <w:rPr>
           <w:lang w:val="ru-RU"/>
         </w:rPr>
-        <w:t xml:space="preserve">Отдельное направление составляют мультимодальные и </w:t>
-      </w:r>
-      <w:proofErr w:type="spellStart"/>
-      <w:r>
-        <w:rPr>
-          <w:lang w:val="ru-RU"/>
-        </w:rPr>
-        <w:t>vision</w:t>
+        <w:t>Отдельное направление составляют мультимодальные и vision</w:t>
       </w:r>
       <w:r>
         <w:rPr>
           <w:lang w:val="ru-RU"/>
         </w:rPr>
         <w:noBreakHyphen/>
-        <w:t>language</w:t>
-      </w:r>
-      <w:proofErr w:type="spellEnd"/>
-      <w:r>
-        <w:rPr>
-          <w:lang w:val="ru-RU"/>
-        </w:rPr>
-        <w:t xml:space="preserve"> модели, где </w:t>
-      </w:r>
-      <w:proofErr w:type="spellStart"/>
-      <w:r>
-        <w:rPr>
-          <w:lang w:val="ru-RU"/>
-        </w:rPr>
-        <w:t>MoE</w:t>
-      </w:r>
-      <w:proofErr w:type="spellEnd"/>
-      <w:r>
-        <w:rPr>
-          <w:lang w:val="ru-RU"/>
-        </w:rPr>
-        <w:t xml:space="preserve"> используется для дифференцированной обработки текстовых и визуальных представлений в рамках единой архитектуры.</w:t>
-      </w:r>
-    </w:p>
-    <w:p>
-      <w:pPr>
-        <w:spacing w:after="0"/>
-        <w:ind w:firstLine="709"/>
-        <w:rPr>
-          <w:lang w:val="ru-RU"/>
-        </w:rPr>
-      </w:pPr>
-      <w:r>
-        <w:rPr>
-          <w:lang w:val="ru-RU"/>
-        </w:rPr>
-        <w:t xml:space="preserve">В таких системах эксперты могут специализироваться по </w:t>
-      </w:r>
-      <w:proofErr w:type="spellStart"/>
-      <w:r>
-        <w:rPr>
-          <w:lang w:val="ru-RU"/>
-        </w:rPr>
-        <w:t>modality</w:t>
-      </w:r>
-      <w:proofErr w:type="spellEnd"/>
-      <w:r>
-        <w:rPr>
-          <w:lang w:val="ru-RU"/>
-        </w:rPr>
-        <w:t xml:space="preserve"> (текст/изображение), типу признаков или диапазону уровней абстракции, а роутер учитывает как модальные, так и контекстные признаки при выборе специалистов.</w:t>
-      </w:r>
-    </w:p>
-    <w:p>
-      <w:pPr>
-        <w:spacing w:after="0"/>
-        <w:ind w:firstLine="709"/>
-        <w:rPr>
-          <w:lang w:val="ru-RU"/>
-        </w:rPr>
-      </w:pPr>
-    </w:p>
-    <w:p>
-      <w:pPr>
-        <w:spacing w:after="0"/>
-        <w:ind w:firstLine="709"/>
-        <w:rPr>
-          <w:b/>
-          <w:bCs/>
-          <w:lang w:val="ru-RU"/>
-        </w:rPr>
-      </w:pPr>
-      <w:r>
-        <w:rPr>
-          <w:b/>
-          <w:bCs/>
-          <w:lang w:val="ru-RU"/>
-        </w:rPr>
-        <w:t xml:space="preserve">1.3. Идентификация ключевых проблем и узких мест в </w:t>
-      </w:r>
-      <w:proofErr w:type="spellStart"/>
-      <w:r>
-        <w:rPr>
-          <w:b/>
-          <w:bCs/>
-          <w:lang w:val="ru-RU"/>
-        </w:rPr>
-        <w:t>роутинге</w:t>
-      </w:r>
-      <w:proofErr w:type="spellEnd"/>
-      <w:r>
-        <w:rPr>
-          <w:b/>
-          <w:bCs/>
-          <w:lang w:val="ru-RU"/>
-        </w:rPr>
-        <w:t xml:space="preserve"> экспертов</w:t>
-      </w:r>
-    </w:p>
-    <w:p>
-      <w:pPr>
-        <w:spacing w:after="0"/>
-        <w:ind w:firstLine="709"/>
-        <w:rPr>
-          <w:lang w:val="ru-RU"/>
-        </w:rPr>
-      </w:pPr>
-      <w:r>
-        <w:rPr>
-          <w:lang w:val="ru-RU"/>
-        </w:rPr>
-        <w:t xml:space="preserve">Несмотря на очевидные преимущества, практическое применение </w:t>
-      </w:r>
-      <w:proofErr w:type="spellStart"/>
-      <w:r>
-        <w:rPr>
-          <w:lang w:val="ru-RU"/>
-        </w:rPr>
-        <w:t>MoE</w:t>
-      </w:r>
-      <w:proofErr w:type="spellEnd"/>
-      <w:r>
-        <w:rPr>
-          <w:lang w:val="ru-RU"/>
-        </w:rPr>
-        <w:t xml:space="preserve"> сталкивается с рядом серьёзных проблем, связанных, прежде всего, с </w:t>
-      </w:r>
-      <w:proofErr w:type="spellStart"/>
-      <w:r>
-        <w:rPr>
-          <w:lang w:val="ru-RU"/>
-        </w:rPr>
-        <w:t>роутингом</w:t>
-      </w:r>
-      <w:proofErr w:type="spellEnd"/>
-      <w:r>
-        <w:rPr>
-          <w:lang w:val="ru-RU"/>
-        </w:rPr>
-        <w:t xml:space="preserve"> экспертов и балансировкой нагрузки.</w:t>
+        <w:t>language модели, где MoE используется для дифференцированной обработки текстовых и визуальных представлений в рамках единой архитектуры.</w:t>
+      </w:r>
+    </w:p>
+    <w:p>
+      <w:pPr>
+        <w:spacing w:after="0"/>
+        <w:ind w:firstLine="709"/>
+        <w:rPr>
+          <w:lang w:val="ru-RU"/>
+        </w:rPr>
+      </w:pPr>
+      <w:r>
+        <w:rPr>
+          <w:lang w:val="ru-RU"/>
+        </w:rPr>
+        <w:t>В таких системах эксперты могут специализироваться по modality (текст/изображение), типу признаков или диапазону уровней абстракции, а роутер учитывает как модальные, так и контекстные признаки при выборе специалистов.</w:t>
+      </w:r>
+    </w:p>
+    <w:p>
+      <w:pPr>
+        <w:spacing w:after="0"/>
+        <w:ind w:firstLine="709"/>
+        <w:rPr>
+          <w:lang w:val="ru-RU"/>
+        </w:rPr>
+      </w:pPr>
+    </w:p>
+    <w:p>
+      <w:pPr>
+        <w:spacing w:after="0"/>
+        <w:ind w:firstLine="709"/>
+        <w:rPr>
+          <w:b/>
+          <w:bCs/>
+          <w:lang w:val="ru-RU"/>
+        </w:rPr>
+      </w:pPr>
+      <w:r>
+        <w:rPr>
+          <w:b/>
+          <w:bCs/>
+          <w:lang w:val="ru-RU"/>
+        </w:rPr>
+        <w:t>1.3. Идентификация ключевых проблем и узких мест в роутинге экспертов</w:t>
+      </w:r>
+    </w:p>
+    <w:p>
+      <w:pPr>
+        <w:spacing w:after="0"/>
+        <w:ind w:firstLine="709"/>
+        <w:rPr>
+          <w:lang w:val="ru-RU"/>
+        </w:rPr>
+      </w:pPr>
+      <w:r>
+        <w:rPr>
+          <w:lang w:val="ru-RU"/>
+        </w:rPr>
+        <w:t>Несмотря на очевидные преимущества, практическое применение MoE сталкивается с рядом серьёзных проблем, связанных, прежде всего, с роутингом экспертов и балансировкой нагрузки.</w:t>
       </w:r>
     </w:p>
     <w:p>
@@ -3484,42 +3217,14 @@
         <w:rPr>
           <w:lang w:val="ru-RU"/>
         </w:rPr>
-        <w:t xml:space="preserve">Для борьбы с этим эффектом в современных архитектурах применяются различные </w:t>
-      </w:r>
-      <w:proofErr w:type="spellStart"/>
-      <w:r>
-        <w:rPr>
-          <w:lang w:val="ru-RU"/>
-        </w:rPr>
-        <w:t>регуляризаторы</w:t>
-      </w:r>
-      <w:proofErr w:type="spellEnd"/>
-      <w:r>
-        <w:rPr>
-          <w:lang w:val="ru-RU"/>
-        </w:rPr>
-        <w:t xml:space="preserve"> и штрафы за дисбаланс, </w:t>
+        <w:t xml:space="preserve">Для борьбы с этим эффектом в современных архитектурах применяются различные регуляризаторы и штрафы за дисбаланс, </w:t>
       </w:r>
       <w:r>
         <w:rPr>
           <w:lang w:val="ru-RU"/>
         </w:rPr>
         <w:lastRenderedPageBreak/>
-        <w:t xml:space="preserve">однако их настройка требует тонкого подбора </w:t>
-      </w:r>
-      <w:proofErr w:type="spellStart"/>
-      <w:r>
-        <w:rPr>
-          <w:lang w:val="ru-RU"/>
-        </w:rPr>
-        <w:t>гиперпараметров</w:t>
-      </w:r>
-      <w:proofErr w:type="spellEnd"/>
-      <w:r>
-        <w:rPr>
-          <w:lang w:val="ru-RU"/>
-        </w:rPr>
-        <w:t xml:space="preserve"> и может вызывать нестабильность обучения.</w:t>
+        <w:t>однако их настройка требует тонкого подбора гиперпараметров и может вызывать нестабильность обучения.</w:t>
       </w:r>
     </w:p>
     <w:p>
@@ -3549,43 +3254,21 @@
         <w:rPr>
           <w:lang w:val="ru-RU"/>
         </w:rPr>
-        <w:t>Ещё одним узким местом является чувствительность качества модели к выбору числа активируемых экспертов, схемы маршрутизации (</w:t>
-      </w:r>
-      <w:proofErr w:type="spellStart"/>
-      <w:r>
-        <w:rPr>
-          <w:lang w:val="ru-RU"/>
-        </w:rPr>
-        <w:t>top</w:t>
-      </w:r>
-      <w:proofErr w:type="spellEnd"/>
+        <w:t>Ещё одним узким местом является чувствительность качества модели к выбору числа активируемых экспертов, схемы маршрутизации (top</w:t>
+      </w:r>
       <w:r>
         <w:rPr>
           <w:lang w:val="ru-RU"/>
         </w:rPr>
         <w:noBreakHyphen/>
-        <w:t xml:space="preserve">k, вероятностный выбор, </w:t>
-      </w:r>
-      <w:proofErr w:type="spellStart"/>
-      <w:r>
-        <w:rPr>
-          <w:lang w:val="ru-RU"/>
-        </w:rPr>
-        <w:t>soft</w:t>
+        <w:t>k, вероятностный выбор, soft</w:t>
       </w:r>
       <w:r>
         <w:rPr>
           <w:lang w:val="ru-RU"/>
         </w:rPr>
         <w:noBreakHyphen/>
-        <w:t>routing</w:t>
-      </w:r>
-      <w:proofErr w:type="spellEnd"/>
-      <w:r>
-        <w:rPr>
-          <w:lang w:val="ru-RU"/>
-        </w:rPr>
-        <w:t>) и способа агрегации выходов.</w:t>
+        <w:t>routing) и способа агрегации выходов.</w:t>
       </w:r>
     </w:p>
     <w:p>
@@ -3630,30 +3313,8 @@
         <w:rPr>
           <w:lang w:val="ru-RU"/>
         </w:rPr>
-        <w:t xml:space="preserve">В подобных системах особенно важны адаптивные механизмы </w:t>
-      </w:r>
-      <w:proofErr w:type="spellStart"/>
-      <w:r>
-        <w:rPr>
-          <w:lang w:val="ru-RU"/>
-        </w:rPr>
-        <w:t>роутинга</w:t>
-      </w:r>
-      <w:proofErr w:type="spellEnd"/>
-      <w:r>
-        <w:rPr>
-          <w:lang w:val="ru-RU"/>
-        </w:rPr>
-        <w:t xml:space="preserve">, способные учитывать как статистику нагрузки, так и семантический контекст, что и обусловливает необходимость разработки гибридных </w:t>
-      </w:r>
-      <w:proofErr w:type="spellStart"/>
-      <w:r>
-        <w:rPr>
-          <w:lang w:val="ru-RU"/>
-        </w:rPr>
-        <w:t>MoE</w:t>
-      </w:r>
-      <w:proofErr w:type="spellEnd"/>
+        <w:t>В подобных системах особенно важны адаптивные механизмы роутинга, способные учитывать как статистику нагрузки, так и семантический контекст, что и обусловливает необходимость разработки гибридных MoE</w:t>
+      </w:r>
       <w:r>
         <w:rPr>
           <w:lang w:val="ru-RU"/>
@@ -3682,9 +3343,6 @@
     <w:p>
       <w:pPr>
         <w:pStyle w:val="1"/>
-        <w:rPr>
-          <w:lang w:val="ru-RU"/>
-        </w:rPr>
       </w:pPr>
       <w:bookmarkStart w:id="5" w:name="_Toc216465010"/>
       <w:r>
@@ -3723,41 +3381,29 @@
         <w:ind w:firstLine="709"/>
         <w:rPr>
           <w:color w:val="auto"/>
-          <w:lang w:val="ru-RU"/>
-        </w:rPr>
-      </w:pPr>
-    </w:p>
-    <w:p>
-      <w:pPr>
-        <w:spacing w:after="0"/>
-        <w:ind w:firstLine="709"/>
-        <w:rPr>
-          <w:b/>
-          <w:bCs/>
-          <w:color w:val="auto"/>
-          <w:lang w:val="ru-RU"/>
-        </w:rPr>
-      </w:pPr>
-      <w:r>
-        <w:rPr>
-          <w:b/>
-          <w:bCs/>
-          <w:color w:val="auto"/>
-          <w:lang w:val="ru-RU"/>
-        </w:rPr>
-        <w:t xml:space="preserve">2.1. Архитектурные особенности предлагаемой гибридной </w:t>
-      </w:r>
-      <w:proofErr w:type="spellStart"/>
-      <w:r>
-        <w:rPr>
-          <w:b/>
-          <w:bCs/>
-          <w:color w:val="auto"/>
-          <w:lang w:val="ru-RU"/>
-        </w:rPr>
-        <w:t>MoE</w:t>
-      </w:r>
-      <w:proofErr w:type="spellEnd"/>
+        </w:rPr>
+      </w:pPr>
+    </w:p>
+    <w:p>
+      <w:pPr>
+        <w:spacing w:after="0"/>
+        <w:ind w:firstLine="709"/>
+        <w:rPr>
+          <w:b/>
+          <w:bCs/>
+          <w:color w:val="auto"/>
+          <w:lang w:val="ru-RU"/>
+        </w:rPr>
+      </w:pPr>
+      <w:r>
+        <w:rPr>
+          <w:b/>
+          <w:bCs/>
+          <w:color w:val="auto"/>
+          <w:lang w:val="ru-RU"/>
+        </w:rPr>
+        <w:t>2.1. Архитектурные особенности предлагаемой гибридной MoE</w:t>
+      </w:r>
       <w:r>
         <w:rPr>
           <w:b/>
@@ -3783,88 +3429,24 @@
           <w:color w:val="auto"/>
           <w:lang w:val="ru-RU"/>
         </w:rPr>
-        <w:t xml:space="preserve">Предлагаемая гибридная архитектура </w:t>
-      </w:r>
-      <w:proofErr w:type="spellStart"/>
-      <w:r>
-        <w:rPr>
-          <w:color w:val="auto"/>
-          <w:lang w:val="ru-RU"/>
-        </w:rPr>
-        <w:t>Mixture</w:t>
-      </w:r>
-      <w:proofErr w:type="spellEnd"/>
-      <w:r>
-        <w:rPr>
-          <w:color w:val="auto"/>
-          <w:lang w:val="ru-RU"/>
-        </w:rPr>
-        <w:t xml:space="preserve"> </w:t>
-      </w:r>
-      <w:proofErr w:type="spellStart"/>
-      <w:r>
-        <w:rPr>
-          <w:color w:val="auto"/>
-          <w:lang w:val="ru-RU"/>
-        </w:rPr>
-        <w:t>of</w:t>
-      </w:r>
-      <w:proofErr w:type="spellEnd"/>
-      <w:r>
-        <w:rPr>
-          <w:color w:val="auto"/>
-          <w:lang w:val="ru-RU"/>
-        </w:rPr>
-        <w:t xml:space="preserve"> </w:t>
-      </w:r>
-      <w:proofErr w:type="spellStart"/>
-      <w:r>
-        <w:rPr>
-          <w:color w:val="auto"/>
-          <w:lang w:val="ru-RU"/>
-        </w:rPr>
-        <w:t>Experts</w:t>
-      </w:r>
-      <w:proofErr w:type="spellEnd"/>
-      <w:r>
-        <w:rPr>
-          <w:color w:val="auto"/>
-          <w:lang w:val="ru-RU"/>
-        </w:rPr>
-        <w:t xml:space="preserve"> ориентирована на одновременную поддержку задач обработки естественного языка и компьютерного зрения в рамках единой модели.</w:t>
-      </w:r>
-    </w:p>
-    <w:p>
-      <w:pPr>
-        <w:spacing w:after="0"/>
-        <w:ind w:firstLine="709"/>
-        <w:rPr>
-          <w:color w:val="auto"/>
-          <w:lang w:val="ru-RU"/>
-        </w:rPr>
-      </w:pPr>
-      <w:r>
-        <w:rPr>
-          <w:color w:val="auto"/>
-          <w:lang w:val="ru-RU"/>
-        </w:rPr>
-        <w:t xml:space="preserve">В её составе выделяются три основных компонента: базовый блок трансформера, модуль экспертов, специализированный по доменам (NLP и CV), и модуль </w:t>
-      </w:r>
-      <w:proofErr w:type="spellStart"/>
-      <w:r>
-        <w:rPr>
-          <w:color w:val="auto"/>
-          <w:lang w:val="ru-RU"/>
-        </w:rPr>
-        <w:t>роутинга</w:t>
-      </w:r>
-      <w:proofErr w:type="spellEnd"/>
-      <w:r>
-        <w:rPr>
-          <w:color w:val="auto"/>
-          <w:lang w:val="ru-RU"/>
-        </w:rPr>
-        <w:t xml:space="preserve"> с механизмами балансировки нагрузки.​</w:t>
+        <w:t>Предлагаемая гибридная архитектура Mixture of Experts ориентирована на одновременную поддержку задач обработки естественного языка и компьютерного зрения в рамках единой модели.</w:t>
+      </w:r>
+    </w:p>
+    <w:p>
+      <w:pPr>
+        <w:spacing w:after="0"/>
+        <w:ind w:firstLine="709"/>
+        <w:rPr>
+          <w:color w:val="auto"/>
+          <w:lang w:val="ru-RU"/>
+        </w:rPr>
+      </w:pPr>
+      <w:r>
+        <w:rPr>
+          <w:color w:val="auto"/>
+          <w:lang w:val="ru-RU"/>
+        </w:rPr>
+        <w:t>В её составе выделяются три основных компонента: базовый блок трансформера, модуль экспертов, специализированный по доменам (NLP и CV), и модуль роутинга с механизмами балансировки нагрузки.​</w:t>
       </w:r>
     </w:p>
     <w:p>
@@ -3889,15 +3471,7 @@
           <w:lang w:val="ru-RU"/>
         </w:rPr>
         <w:noBreakHyphen/>
-        <w:t xml:space="preserve">подобная архитектура, в которой стандартные плотные </w:t>
-      </w:r>
-      <w:proofErr w:type="spellStart"/>
-      <w:r>
-        <w:rPr>
-          <w:color w:val="auto"/>
-          <w:lang w:val="ru-RU"/>
-        </w:rPr>
-        <w:t>feed</w:t>
+        <w:t>подобная архитектура, в которой стандартные плотные feed</w:t>
       </w:r>
       <w:r>
         <w:rPr>
@@ -3905,23 +3479,7 @@
           <w:lang w:val="ru-RU"/>
         </w:rPr>
         <w:noBreakHyphen/>
-        <w:t>forward</w:t>
-      </w:r>
-      <w:proofErr w:type="spellEnd"/>
-      <w:r>
-        <w:rPr>
-          <w:color w:val="auto"/>
-          <w:lang w:val="ru-RU"/>
-        </w:rPr>
-        <w:t xml:space="preserve"> слои частично заменяются </w:t>
-      </w:r>
-      <w:proofErr w:type="spellStart"/>
-      <w:r>
-        <w:rPr>
-          <w:color w:val="auto"/>
-          <w:lang w:val="ru-RU"/>
-        </w:rPr>
-        <w:t>MoE</w:t>
+        <w:t>forward слои частично заменяются MoE</w:t>
       </w:r>
       <w:r>
         <w:rPr>
@@ -3931,7 +3489,6 @@
         <w:noBreakHyphen/>
         <w:t>слоями.</w:t>
       </w:r>
-      <w:proofErr w:type="spellEnd"/>
     </w:p>
     <w:p>
       <w:pPr>
@@ -3964,17 +3521,8 @@
           <w:color w:val="auto"/>
           <w:lang w:val="ru-RU"/>
         </w:rPr>
-        <w:t xml:space="preserve">В отличие от классических </w:t>
-      </w:r>
-      <w:proofErr w:type="spellStart"/>
-      <w:r>
-        <w:rPr>
-          <w:color w:val="auto"/>
-          <w:lang w:val="ru-RU"/>
-        </w:rPr>
-        <w:t>MoE</w:t>
-      </w:r>
-      <w:proofErr w:type="spellEnd"/>
+        <w:t>В отличие от классических MoE</w:t>
+      </w:r>
       <w:r>
         <w:rPr>
           <w:color w:val="auto"/>
@@ -3998,15 +3546,7 @@
           <w:color w:val="auto"/>
           <w:lang w:val="ru-RU"/>
         </w:rPr>
-        <w:t xml:space="preserve">Текстовые эксперты реализуются в виде расширенных </w:t>
-      </w:r>
-      <w:proofErr w:type="spellStart"/>
-      <w:r>
-        <w:rPr>
-          <w:color w:val="auto"/>
-          <w:lang w:val="ru-RU"/>
-        </w:rPr>
-        <w:t>feed</w:t>
+        <w:t>Текстовые эксперты реализуются в виде расширенных feed</w:t>
       </w:r>
       <w:r>
         <w:rPr>
@@ -4014,15 +3554,7 @@
           <w:lang w:val="ru-RU"/>
         </w:rPr>
         <w:noBreakHyphen/>
-        <w:t>forward</w:t>
-      </w:r>
-      <w:proofErr w:type="spellEnd"/>
-      <w:r>
-        <w:rPr>
-          <w:color w:val="auto"/>
-          <w:lang w:val="ru-RU"/>
-        </w:rPr>
-        <w:t xml:space="preserve"> блоков с возможностью адаптации к длине последовательности, тогда как визуальные эксперты могут включать </w:t>
+        <w:t xml:space="preserve">forward блоков с возможностью адаптации к длине последовательности, тогда как визуальные эксперты могут включать </w:t>
       </w:r>
       <w:r>
         <w:rPr>
@@ -4030,107 +3562,55 @@
           <w:lang w:val="ru-RU"/>
         </w:rPr>
         <w:lastRenderedPageBreak/>
-        <w:t xml:space="preserve">операции над патчами или </w:t>
-      </w:r>
-      <w:proofErr w:type="spellStart"/>
-      <w:r>
-        <w:rPr>
-          <w:color w:val="auto"/>
-          <w:lang w:val="ru-RU"/>
-        </w:rPr>
-        <w:t>сверточные</w:t>
-      </w:r>
-      <w:proofErr w:type="spellEnd"/>
-      <w:r>
-        <w:rPr>
-          <w:color w:val="auto"/>
-          <w:lang w:val="ru-RU"/>
-        </w:rPr>
-        <w:t xml:space="preserve"> компоненты для более эффективной обработки пространственных структур.​</w:t>
-      </w:r>
-    </w:p>
-    <w:p>
-      <w:pPr>
-        <w:spacing w:after="0"/>
-        <w:ind w:firstLine="709"/>
-        <w:rPr>
-          <w:color w:val="auto"/>
-          <w:lang w:val="ru-RU"/>
-        </w:rPr>
-      </w:pPr>
-    </w:p>
-    <w:p>
-      <w:pPr>
-        <w:spacing w:after="0"/>
-        <w:ind w:firstLine="709"/>
-        <w:rPr>
-          <w:b/>
-          <w:bCs/>
-          <w:color w:val="auto"/>
-          <w:lang w:val="ru-RU"/>
-        </w:rPr>
-      </w:pPr>
-      <w:r>
-        <w:rPr>
-          <w:b/>
-          <w:bCs/>
-          <w:color w:val="auto"/>
-          <w:lang w:val="ru-RU"/>
-        </w:rPr>
-        <w:t xml:space="preserve">2.2. Детальное описание модифицированного алгоритма </w:t>
-      </w:r>
-      <w:proofErr w:type="spellStart"/>
-      <w:r>
-        <w:rPr>
-          <w:b/>
-          <w:bCs/>
-          <w:color w:val="auto"/>
-          <w:lang w:val="ru-RU"/>
-        </w:rPr>
-        <w:t>роутинга</w:t>
-      </w:r>
-      <w:proofErr w:type="spellEnd"/>
-      <w:r>
-        <w:rPr>
-          <w:b/>
-          <w:bCs/>
-          <w:color w:val="auto"/>
-          <w:lang w:val="ru-RU"/>
-        </w:rPr>
-        <w:t xml:space="preserve"> с балансировкой нагрузки</w:t>
-      </w:r>
-    </w:p>
-    <w:p>
-      <w:pPr>
-        <w:spacing w:after="0"/>
-        <w:ind w:firstLine="709"/>
-        <w:rPr>
-          <w:color w:val="auto"/>
-          <w:lang w:val="ru-RU"/>
-        </w:rPr>
-      </w:pPr>
-      <w:r>
-        <w:rPr>
-          <w:color w:val="auto"/>
-          <w:lang w:val="ru-RU"/>
-        </w:rPr>
-        <w:t xml:space="preserve">Ключевым элементом предлагаемой архитектуры является модифицированный алгоритм </w:t>
-      </w:r>
-      <w:proofErr w:type="spellStart"/>
-      <w:r>
-        <w:rPr>
-          <w:color w:val="auto"/>
-          <w:lang w:val="ru-RU"/>
-        </w:rPr>
-        <w:t>роутинга</w:t>
-      </w:r>
-      <w:proofErr w:type="spellEnd"/>
-      <w:r>
-        <w:rPr>
-          <w:color w:val="auto"/>
-          <w:lang w:val="ru-RU"/>
-        </w:rPr>
-        <w:t>, который решает задачу распределения входных представлений по экспертам с учётом доменной принадлежности и текущей загрузки.</w:t>
+        <w:t>операции над патчами или сверточные компоненты для более эффективной обработки пространственных структур.​</w:t>
+      </w:r>
+    </w:p>
+    <w:p>
+      <w:pPr>
+        <w:spacing w:after="0"/>
+        <w:ind w:firstLine="709"/>
+        <w:rPr>
+          <w:color w:val="auto"/>
+          <w:lang w:val="ru-RU"/>
+        </w:rPr>
+      </w:pPr>
+    </w:p>
+    <w:p>
+      <w:pPr>
+        <w:spacing w:after="0"/>
+        <w:ind w:firstLine="709"/>
+        <w:rPr>
+          <w:b/>
+          <w:bCs/>
+          <w:color w:val="auto"/>
+          <w:lang w:val="ru-RU"/>
+        </w:rPr>
+      </w:pPr>
+      <w:r>
+        <w:rPr>
+          <w:b/>
+          <w:bCs/>
+          <w:color w:val="auto"/>
+          <w:lang w:val="ru-RU"/>
+        </w:rPr>
+        <w:t>2.2. Детальное описание модифицированного алгоритма роутинга с балансировкой нагрузки</w:t>
+      </w:r>
+    </w:p>
+    <w:p>
+      <w:pPr>
+        <w:spacing w:after="0"/>
+        <w:ind w:firstLine="709"/>
+        <w:rPr>
+          <w:color w:val="auto"/>
+          <w:lang w:val="ru-RU"/>
+        </w:rPr>
+      </w:pPr>
+      <w:r>
+        <w:rPr>
+          <w:color w:val="auto"/>
+          <w:lang w:val="ru-RU"/>
+        </w:rPr>
+        <w:t>Ключевым элементом предлагаемой архитектуры является модифицированный алгоритм роутинга, который решает задачу распределения входных представлений по экспертам с учётом доменной принадлежности и текущей загрузки.</w:t>
       </w:r>
     </w:p>
     <w:p>
@@ -4164,17 +3644,8 @@
           <w:color w:val="auto"/>
           <w:lang w:val="ru-RU"/>
         </w:rPr>
-        <w:t xml:space="preserve">На втором этапе используется </w:t>
-      </w:r>
-      <w:proofErr w:type="spellStart"/>
-      <w:r>
-        <w:rPr>
-          <w:color w:val="auto"/>
-          <w:lang w:val="ru-RU"/>
-        </w:rPr>
-        <w:t>top</w:t>
-      </w:r>
-      <w:proofErr w:type="spellEnd"/>
+        <w:t>На втором этапе используется top</w:t>
+      </w:r>
       <w:r>
         <w:rPr>
           <w:color w:val="auto"/>
@@ -4214,23 +3685,7 @@
           <w:lang w:val="ru-RU"/>
         </w:rPr>
         <w:noBreakHyphen/>
-        <w:t xml:space="preserve">эксперта рассчитывается объединённый скоринг, включающий базовый </w:t>
-      </w:r>
-      <w:proofErr w:type="spellStart"/>
-      <w:r>
-        <w:rPr>
-          <w:color w:val="auto"/>
-          <w:lang w:val="ru-RU"/>
-        </w:rPr>
-        <w:t>логит</w:t>
-      </w:r>
-      <w:proofErr w:type="spellEnd"/>
-      <w:r>
-        <w:rPr>
-          <w:color w:val="auto"/>
-          <w:lang w:val="ru-RU"/>
-        </w:rPr>
-        <w:t xml:space="preserve"> роутера и штраф за перегрузку, благодаря чему часто используемые эксперты получают пониженный приоритет, а недозагруженные — повышенный.​</w:t>
+        <w:t>эксперта рассчитывается объединённый скоринг, включающий базовый логит роутера и штраф за перегрузку, благодаря чему часто используемые эксперты получают пониженный приоритет, а недозагруженные — повышенный.​</w:t>
       </w:r>
     </w:p>
     <w:p>
@@ -4381,23 +3836,7 @@
           <w:color w:val="auto"/>
           <w:lang w:val="ru-RU"/>
         </w:rPr>
-        <w:t xml:space="preserve">Визуальные эксперты, в свою очередь, оперируют патчами изображений или признаками после предварительного визуального </w:t>
-      </w:r>
-      <w:proofErr w:type="spellStart"/>
-      <w:r>
-        <w:rPr>
-          <w:color w:val="auto"/>
-          <w:lang w:val="ru-RU"/>
-        </w:rPr>
-        <w:t>энкодера</w:t>
-      </w:r>
-      <w:proofErr w:type="spellEnd"/>
-      <w:r>
-        <w:rPr>
-          <w:color w:val="auto"/>
-          <w:lang w:val="ru-RU"/>
-        </w:rPr>
-        <w:t xml:space="preserve"> и могут содержать дополнительные слои для учёта пространственной структуры.​</w:t>
+        <w:t>Визуальные эксперты, в свою очередь, оперируют патчами изображений или признаками после предварительного визуального энкодера и могут содержать дополнительные слои для учёта пространственной структуры.​</w:t>
       </w:r>
     </w:p>
     <w:p>
@@ -4434,7 +3873,6 @@
         </w:rPr>
         <w:t xml:space="preserve">Это позволяет реализовать механизм переноса знаний между доменами и повысить </w:t>
       </w:r>
-      <w:proofErr w:type="spellStart"/>
       <w:r>
         <w:rPr>
           <w:color w:val="auto"/>
@@ -4442,7 +3880,6 @@
         </w:rPr>
         <w:t>переиспользование</w:t>
       </w:r>
-      <w:proofErr w:type="spellEnd"/>
       <w:r>
         <w:rPr>
           <w:color w:val="auto"/>
@@ -4496,73 +3933,32 @@
           <w:color w:val="auto"/>
           <w:lang w:val="ru-RU"/>
         </w:rPr>
-        <w:t xml:space="preserve">Для оценки предлагаемой гибридной архитектуры разрабатывается прототип модели, реализующий описанные выше </w:t>
-      </w:r>
-      <w:proofErr w:type="spellStart"/>
-      <w:r>
-        <w:rPr>
-          <w:color w:val="auto"/>
-          <w:lang w:val="ru-RU"/>
-        </w:rPr>
-        <w:t>MoE</w:t>
-      </w:r>
-      <w:proofErr w:type="spellEnd"/>
+        <w:t>Для оценки предлагаемой гибридной архитектуры разрабатывается прототип модели, реализующий описанные выше MoE</w:t>
+      </w:r>
       <w:r>
         <w:rPr>
           <w:color w:val="auto"/>
           <w:lang w:val="ru-RU"/>
         </w:rPr>
         <w:noBreakHyphen/>
-        <w:t xml:space="preserve">слои, алгоритм </w:t>
-      </w:r>
-      <w:proofErr w:type="spellStart"/>
-      <w:r>
-        <w:rPr>
-          <w:color w:val="auto"/>
-          <w:lang w:val="ru-RU"/>
-        </w:rPr>
-        <w:t>роутинга</w:t>
-      </w:r>
-      <w:proofErr w:type="spellEnd"/>
-      <w:r>
-        <w:rPr>
-          <w:color w:val="auto"/>
-          <w:lang w:val="ru-RU"/>
-        </w:rPr>
-        <w:t xml:space="preserve"> и набор специализированных экспертов.</w:t>
-      </w:r>
-    </w:p>
-    <w:p>
-      <w:pPr>
-        <w:spacing w:after="0"/>
-        <w:ind w:firstLine="709"/>
-        <w:rPr>
-          <w:color w:val="auto"/>
-          <w:lang w:val="ru-RU"/>
-        </w:rPr>
-      </w:pPr>
-      <w:r>
-        <w:rPr>
-          <w:color w:val="auto"/>
-          <w:lang w:val="ru-RU"/>
-        </w:rPr>
-        <w:t xml:space="preserve">Прототип настраивается таким образом, чтобы оставаться сопоставимым по числу активных параметров и вычислительному бюджету с базовыми плотными моделями и классическими </w:t>
-      </w:r>
-      <w:proofErr w:type="spellStart"/>
-      <w:r>
-        <w:rPr>
-          <w:color w:val="auto"/>
-          <w:lang w:val="ru-RU"/>
-        </w:rPr>
-        <w:t>MoE</w:t>
-      </w:r>
-      <w:proofErr w:type="spellEnd"/>
-      <w:r>
-        <w:rPr>
-          <w:color w:val="auto"/>
-          <w:lang w:val="ru-RU"/>
-        </w:rPr>
-        <w:t>, что обеспечивает корректность сравнения.​</w:t>
+        <w:t>слои, алгоритм роутинга и набор специализированных экспертов.</w:t>
+      </w:r>
+    </w:p>
+    <w:p>
+      <w:pPr>
+        <w:spacing w:after="0"/>
+        <w:ind w:firstLine="709"/>
+        <w:rPr>
+          <w:color w:val="auto"/>
+          <w:lang w:val="ru-RU"/>
+        </w:rPr>
+      </w:pPr>
+      <w:r>
+        <w:rPr>
+          <w:color w:val="auto"/>
+          <w:lang w:val="ru-RU"/>
+        </w:rPr>
+        <w:t>Прототип настраивается таким образом, чтобы оставаться сопоставимым по числу активных параметров и вычислительному бюджету с базовыми плотными моделями и классическими MoE, что обеспечивает корректность сравнения.​</w:t>
       </w:r>
     </w:p>
     <w:p>
@@ -4596,23 +3992,7 @@
           <w:color w:val="auto"/>
           <w:lang w:val="ru-RU"/>
         </w:rPr>
-        <w:t xml:space="preserve">Для компьютерного зрения в качестве основного датасета предполагается использование </w:t>
-      </w:r>
-      <w:proofErr w:type="spellStart"/>
-      <w:r>
-        <w:rPr>
-          <w:color w:val="auto"/>
-          <w:lang w:val="ru-RU"/>
-        </w:rPr>
-        <w:t>ImageNet</w:t>
-      </w:r>
-      <w:proofErr w:type="spellEnd"/>
-      <w:r>
-        <w:rPr>
-          <w:color w:val="auto"/>
-          <w:lang w:val="ru-RU"/>
-        </w:rPr>
-        <w:t>, позволяющего оценивать качество распознавания объектов и чувствительность модели к масштабированию размерности признаков.​</w:t>
+        <w:t>Для компьютерного зрения в качестве основного датасета предполагается использование ImageNet, позволяющего оценивать качество распознавания объектов и чувствительность модели к масштабированию размерности признаков.​</w:t>
       </w:r>
     </w:p>
     <w:p>
@@ -4630,23 +4010,7 @@
           <w:lang w:val="ru-RU"/>
         </w:rPr>
         <w:lastRenderedPageBreak/>
-        <w:t>Экспериментальный протокол включает сравнение по ключевым метрикам качества (</w:t>
-      </w:r>
-      <w:proofErr w:type="spellStart"/>
-      <w:r>
-        <w:rPr>
-          <w:color w:val="auto"/>
-          <w:lang w:val="ru-RU"/>
-        </w:rPr>
-        <w:t>accuracy</w:t>
-      </w:r>
-      <w:proofErr w:type="spellEnd"/>
-      <w:r>
-        <w:rPr>
-          <w:color w:val="auto"/>
-          <w:lang w:val="ru-RU"/>
-        </w:rPr>
-        <w:t>, F1</w:t>
+        <w:t>Экспериментальный протокол включает сравнение по ключевым метрикам качества (accuracy, F1</w:t>
       </w:r>
       <w:r>
         <w:rPr>
@@ -4654,73 +4018,32 @@
           <w:lang w:val="ru-RU"/>
         </w:rPr>
         <w:noBreakHyphen/>
-        <w:t xml:space="preserve">мера и др.), а также по показателям производительности: времени </w:t>
-      </w:r>
-      <w:proofErr w:type="spellStart"/>
-      <w:r>
-        <w:rPr>
-          <w:color w:val="auto"/>
-          <w:lang w:val="ru-RU"/>
-        </w:rPr>
-        <w:t>инференса</w:t>
-      </w:r>
-      <w:proofErr w:type="spellEnd"/>
-      <w:r>
-        <w:rPr>
-          <w:color w:val="auto"/>
-          <w:lang w:val="ru-RU"/>
-        </w:rPr>
-        <w:t>, использованию памяти и степени равномерности загрузки экспертов.</w:t>
-      </w:r>
-    </w:p>
-    <w:p>
-      <w:pPr>
-        <w:spacing w:after="0"/>
-        <w:ind w:firstLine="709"/>
-        <w:rPr>
-          <w:color w:val="auto"/>
-          <w:lang w:val="ru-RU"/>
-        </w:rPr>
-      </w:pPr>
-      <w:r>
-        <w:rPr>
-          <w:color w:val="auto"/>
-          <w:lang w:val="ru-RU"/>
-        </w:rPr>
-        <w:t xml:space="preserve">Дополнительно планируется проведение </w:t>
-      </w:r>
-      <w:proofErr w:type="spellStart"/>
-      <w:r>
-        <w:rPr>
-          <w:color w:val="auto"/>
-          <w:lang w:val="ru-RU"/>
-        </w:rPr>
-        <w:t>ablation</w:t>
-      </w:r>
-      <w:proofErr w:type="spellEnd"/>
+        <w:t>мера и др.), а также по показателям производительности: времени инференса, использованию памяти и степени равномерности загрузки экспертов.</w:t>
+      </w:r>
+    </w:p>
+    <w:p>
+      <w:pPr>
+        <w:spacing w:after="0"/>
+        <w:ind w:firstLine="709"/>
+        <w:rPr>
+          <w:color w:val="auto"/>
+          <w:lang w:val="ru-RU"/>
+        </w:rPr>
+      </w:pPr>
+      <w:r>
+        <w:rPr>
+          <w:color w:val="auto"/>
+          <w:lang w:val="ru-RU"/>
+        </w:rPr>
+        <w:t>Дополнительно планируется проведение ablation</w:t>
+      </w:r>
       <w:r>
         <w:rPr>
           <w:color w:val="auto"/>
           <w:lang w:val="ru-RU"/>
         </w:rPr>
         <w:noBreakHyphen/>
-        <w:t xml:space="preserve">исследований, в которых поочерёдно отключаются или модифицируются отдельные элементы гибридной архитектуры и алгоритма </w:t>
-      </w:r>
-      <w:proofErr w:type="spellStart"/>
-      <w:r>
-        <w:rPr>
-          <w:color w:val="auto"/>
-          <w:lang w:val="ru-RU"/>
-        </w:rPr>
-        <w:t>роутинга</w:t>
-      </w:r>
-      <w:proofErr w:type="spellEnd"/>
-      <w:r>
-        <w:rPr>
-          <w:color w:val="auto"/>
-          <w:lang w:val="ru-RU"/>
-        </w:rPr>
-        <w:t xml:space="preserve"> для выявления их вклада в итоговый результат.</w:t>
+        <w:t>исследований, в которых поочерёдно отключаются или модифицируются отдельные элементы гибридной архитектуры и алгоритма роутинга для выявления их вклада в итоговый результат.</w:t>
       </w:r>
     </w:p>
     <w:p>
@@ -4803,49 +4126,7 @@
         <w:rPr>
           <w:lang w:val="ru-RU"/>
         </w:rPr>
-        <w:t xml:space="preserve">Экспериментальная оценка гибридной архитектуры </w:t>
-      </w:r>
-      <w:proofErr w:type="spellStart"/>
-      <w:r>
-        <w:rPr>
-          <w:lang w:val="ru-RU"/>
-        </w:rPr>
-        <w:t>Mixture</w:t>
-      </w:r>
-      <w:proofErr w:type="spellEnd"/>
-      <w:r>
-        <w:rPr>
-          <w:lang w:val="ru-RU"/>
-        </w:rPr>
-        <w:t xml:space="preserve"> </w:t>
-      </w:r>
-      <w:proofErr w:type="spellStart"/>
-      <w:r>
-        <w:rPr>
-          <w:lang w:val="ru-RU"/>
-        </w:rPr>
-        <w:t>of</w:t>
-      </w:r>
-      <w:proofErr w:type="spellEnd"/>
-      <w:r>
-        <w:rPr>
-          <w:lang w:val="ru-RU"/>
-        </w:rPr>
-        <w:t xml:space="preserve"> </w:t>
-      </w:r>
-      <w:proofErr w:type="spellStart"/>
-      <w:r>
-        <w:rPr>
-          <w:lang w:val="ru-RU"/>
-        </w:rPr>
-        <w:t>Experts</w:t>
-      </w:r>
-      <w:proofErr w:type="spellEnd"/>
-      <w:r>
-        <w:rPr>
-          <w:lang w:val="ru-RU"/>
-        </w:rPr>
-        <w:t xml:space="preserve"> проводится в единой программно</w:t>
+        <w:t>Экспериментальная оценка гибридной архитектуры Mixture of Experts проводится в единой программно</w:t>
       </w:r>
       <w:r>
         <w:rPr>
@@ -4882,88 +4163,37 @@
         <w:rPr>
           <w:lang w:val="ru-RU"/>
         </w:rPr>
-        <w:t xml:space="preserve">Для всех рассматриваемых моделей используются сопоставимые конфигурации </w:t>
-      </w:r>
-      <w:proofErr w:type="spellStart"/>
-      <w:r>
-        <w:rPr>
-          <w:lang w:val="ru-RU"/>
-        </w:rPr>
-        <w:t>гиперпараметров</w:t>
-      </w:r>
-      <w:proofErr w:type="spellEnd"/>
-      <w:r>
-        <w:rPr>
-          <w:lang w:val="ru-RU"/>
-        </w:rPr>
-        <w:t>: длина секвенций и размерность скрытых представлений, число слоёв трансформера, размер мини</w:t>
+        <w:t>Для всех рассматриваемых моделей используются сопоставимые конфигурации гиперпараметров: длина секвенций и размерность скрытых представлений, число слоёв трансформера, размер мини</w:t>
       </w:r>
       <w:r>
         <w:rPr>
           <w:lang w:val="ru-RU"/>
         </w:rPr>
         <w:noBreakHyphen/>
-      </w:r>
-      <w:proofErr w:type="spellStart"/>
-      <w:r>
-        <w:rPr>
-          <w:lang w:val="ru-RU"/>
-        </w:rPr>
-        <w:t>батча</w:t>
-      </w:r>
-      <w:proofErr w:type="spellEnd"/>
-      <w:r>
-        <w:rPr>
-          <w:lang w:val="ru-RU"/>
-        </w:rPr>
-        <w:t xml:space="preserve">, шаг обучения, стратегия его изменения, а также набор </w:t>
-      </w:r>
-      <w:proofErr w:type="spellStart"/>
-      <w:r>
-        <w:rPr>
-          <w:lang w:val="ru-RU"/>
-        </w:rPr>
-        <w:t>регуляризаторов.</w:t>
-      </w:r>
-      <w:proofErr w:type="spellEnd"/>
-    </w:p>
-    <w:p>
-      <w:pPr>
-        <w:spacing w:after="0"/>
-        <w:ind w:firstLine="709"/>
-        <w:rPr>
-          <w:lang w:val="ru-RU"/>
-        </w:rPr>
-      </w:pPr>
-      <w:r>
-        <w:rPr>
-          <w:lang w:val="ru-RU"/>
-        </w:rPr>
-        <w:t xml:space="preserve">В случае </w:t>
-      </w:r>
-      <w:proofErr w:type="spellStart"/>
-      <w:r>
-        <w:rPr>
-          <w:lang w:val="ru-RU"/>
-        </w:rPr>
-        <w:t>MoE</w:t>
-      </w:r>
-      <w:proofErr w:type="spellEnd"/>
+        <w:t>батча, шаг обучения, стратегия его изменения, а также набор регуляризаторов.</w:t>
+      </w:r>
+    </w:p>
+    <w:p>
+      <w:pPr>
+        <w:spacing w:after="0"/>
+        <w:ind w:firstLine="709"/>
+        <w:rPr>
+          <w:lang w:val="ru-RU"/>
+        </w:rPr>
+      </w:pPr>
+      <w:r>
+        <w:rPr>
+          <w:lang w:val="ru-RU"/>
+        </w:rPr>
+        <w:t>В случае MoE</w:t>
+      </w:r>
       <w:r>
         <w:rPr>
           <w:lang w:val="ru-RU"/>
         </w:rPr>
         <w:noBreakHyphen/>
-        <w:t xml:space="preserve">архитектур дополнительно фиксируются число экспертов, значение k в </w:t>
-      </w:r>
-      <w:proofErr w:type="spellStart"/>
-      <w:r>
-        <w:rPr>
-          <w:lang w:val="ru-RU"/>
-        </w:rPr>
-        <w:t>top</w:t>
-      </w:r>
-      <w:proofErr w:type="spellEnd"/>
+        <w:t>архитектур дополнительно фиксируются число экспертов, значение k в top</w:t>
+      </w:r>
       <w:r>
         <w:rPr>
           <w:lang w:val="ru-RU"/>
@@ -4976,56 +4206,29 @@
           <w:lang w:val="ru-RU"/>
         </w:rPr>
         <w:noBreakHyphen/>
-      </w:r>
-      <w:proofErr w:type="spellStart"/>
-      <w:r>
-        <w:rPr>
-          <w:lang w:val="ru-RU"/>
-        </w:rPr>
-        <w:t>роутинге</w:t>
-      </w:r>
-      <w:proofErr w:type="spellEnd"/>
-      <w:r>
-        <w:rPr>
-          <w:lang w:val="ru-RU"/>
-        </w:rPr>
-        <w:t xml:space="preserve"> и параметры балансировочных штрафов, что обеспечивает корректность сопоставления с монолитными моделями.</w:t>
-      </w:r>
-    </w:p>
-    <w:p>
-      <w:pPr>
-        <w:spacing w:after="0"/>
-        <w:ind w:firstLine="709"/>
-        <w:rPr>
-          <w:lang w:val="ru-RU"/>
-        </w:rPr>
-      </w:pPr>
-      <w:r>
-        <w:rPr>
-          <w:lang w:val="ru-RU"/>
-        </w:rPr>
-        <w:t>Обучение проводится в несколько этапов: начальная фаза разогрева (</w:t>
-      </w:r>
-      <w:proofErr w:type="spellStart"/>
-      <w:r>
-        <w:rPr>
-          <w:lang w:val="ru-RU"/>
-        </w:rPr>
-        <w:t>warm</w:t>
+        <w:t>роутинге и параметры балансировочных штрафов, что обеспечивает корректность сопоставления с монолитными моделями.</w:t>
+      </w:r>
+    </w:p>
+    <w:p>
+      <w:pPr>
+        <w:spacing w:after="0"/>
+        <w:ind w:firstLine="709"/>
+        <w:rPr>
+          <w:lang w:val="ru-RU"/>
+        </w:rPr>
+      </w:pPr>
+      <w:r>
+        <w:rPr>
+          <w:lang w:val="ru-RU"/>
+        </w:rPr>
+        <w:t>Обучение проводится в несколько этапов: начальная фаза разогрева (warm</w:t>
       </w:r>
       <w:r>
         <w:rPr>
           <w:lang w:val="ru-RU"/>
         </w:rPr>
         <w:noBreakHyphen/>
-        <w:t>up</w:t>
-      </w:r>
-      <w:proofErr w:type="spellEnd"/>
-      <w:r>
-        <w:rPr>
-          <w:lang w:val="ru-RU"/>
-        </w:rPr>
-        <w:t xml:space="preserve">), основная фаза оптимизации и, при необходимости, короткая фаза дообучения с уменьшенным шагом. Для оценки устойчивости результатов выполняется несколько независимых </w:t>
+        <w:t xml:space="preserve">up), основная фаза оптимизации и, при необходимости, короткая фаза дообучения с уменьшенным шагом. Для оценки устойчивости результатов выполняется несколько независимых </w:t>
       </w:r>
       <w:r>
         <w:rPr>
@@ -5060,25 +4263,7 @@
           <w:bCs/>
           <w:lang w:val="ru-RU"/>
         </w:rPr>
-        <w:t>3.2. Результаты тестирования на бенчмарках NLP (GLUE) и CV (</w:t>
-      </w:r>
-      <w:proofErr w:type="spellStart"/>
-      <w:r>
-        <w:rPr>
-          <w:b/>
-          <w:bCs/>
-          <w:lang w:val="ru-RU"/>
-        </w:rPr>
-        <w:t>ImageNet</w:t>
-      </w:r>
-      <w:proofErr w:type="spellEnd"/>
-      <w:r>
-        <w:rPr>
-          <w:b/>
-          <w:bCs/>
-          <w:lang w:val="ru-RU"/>
-        </w:rPr>
-        <w:t>)</w:t>
+        <w:t>3.2. Результаты тестирования на бенчмарках NLP (GLUE) и CV (ImageNet)</w:t>
       </w:r>
     </w:p>
     <w:p>
@@ -5108,51 +4293,15 @@
         <w:rPr>
           <w:lang w:val="ru-RU"/>
         </w:rPr>
-        <w:t>Для каждой подзадачи фиксируются стандартные метрики (</w:t>
-      </w:r>
-      <w:proofErr w:type="spellStart"/>
-      <w:r>
-        <w:rPr>
-          <w:lang w:val="ru-RU"/>
-        </w:rPr>
-        <w:t>accuracy</w:t>
-      </w:r>
-      <w:proofErr w:type="spellEnd"/>
-      <w:r>
-        <w:rPr>
-          <w:lang w:val="ru-RU"/>
-        </w:rPr>
-        <w:t>, F1</w:t>
+        <w:t>Для каждой подзадачи фиксируются стандартные метрики (accuracy, F1</w:t>
       </w:r>
       <w:r>
         <w:rPr>
           <w:lang w:val="ru-RU"/>
         </w:rPr>
         <w:noBreakHyphen/>
-        <w:t xml:space="preserve">мера, </w:t>
-      </w:r>
-      <w:proofErr w:type="spellStart"/>
-      <w:r>
-        <w:rPr>
-          <w:lang w:val="ru-RU"/>
-        </w:rPr>
-        <w:t>Spearman</w:t>
-      </w:r>
-      <w:proofErr w:type="spellEnd"/>
-      <w:r>
-        <w:rPr>
-          <w:lang w:val="ru-RU"/>
-        </w:rPr>
-        <w:t>/</w:t>
-      </w:r>
-      <w:proofErr w:type="spellStart"/>
-      <w:r>
-        <w:rPr>
-          <w:lang w:val="ru-RU"/>
-        </w:rPr>
-        <w:t>Pearson</w:t>
-      </w:r>
-      <w:proofErr w:type="spellEnd"/>
+        <w:t>мера, Spearman/Pearson</w:t>
+      </w:r>
       <w:r>
         <w:rPr>
           <w:lang w:val="ru-RU"/>
@@ -5173,21 +4322,7 @@
         <w:rPr>
           <w:lang w:val="ru-RU"/>
         </w:rPr>
-        <w:t xml:space="preserve">В визуальном домене используется датасет </w:t>
-      </w:r>
-      <w:proofErr w:type="spellStart"/>
-      <w:r>
-        <w:rPr>
-          <w:lang w:val="ru-RU"/>
-        </w:rPr>
-        <w:t>ImageNet</w:t>
-      </w:r>
-      <w:proofErr w:type="spellEnd"/>
-      <w:r>
-        <w:rPr>
-          <w:lang w:val="ru-RU"/>
-        </w:rPr>
-        <w:t>, на котором измеряются метрики top</w:t>
+        <w:t>В визуальном домене используется датасет ImageNet, на котором измеряются метрики top</w:t>
       </w:r>
       <w:r>
         <w:rPr>
@@ -5201,60 +4336,30 @@
           <w:lang w:val="ru-RU"/>
         </w:rPr>
         <w:noBreakHyphen/>
-        <w:t xml:space="preserve">5 </w:t>
-      </w:r>
-      <w:proofErr w:type="spellStart"/>
-      <w:r>
-        <w:rPr>
-          <w:lang w:val="ru-RU"/>
-        </w:rPr>
-        <w:t>accuracy</w:t>
-      </w:r>
-      <w:proofErr w:type="spellEnd"/>
-      <w:r>
-        <w:rPr>
-          <w:lang w:val="ru-RU"/>
-        </w:rPr>
-        <w:t>, а также анализируется чувствительность качества к изменению размера модели и числа активируемых экспертов.</w:t>
-      </w:r>
-    </w:p>
-    <w:p>
-      <w:pPr>
-        <w:spacing w:after="0"/>
-        <w:ind w:firstLine="709"/>
-        <w:rPr>
-          <w:lang w:val="ru-RU"/>
-        </w:rPr>
-      </w:pPr>
-      <w:r>
-        <w:rPr>
-          <w:lang w:val="ru-RU"/>
-        </w:rPr>
-        <w:t xml:space="preserve">Это даёт возможность оценить, насколько гибридная </w:t>
-      </w:r>
-      <w:proofErr w:type="spellStart"/>
-      <w:r>
-        <w:rPr>
-          <w:lang w:val="ru-RU"/>
-        </w:rPr>
-        <w:t>MoE</w:t>
-      </w:r>
-      <w:proofErr w:type="spellEnd"/>
+        <w:t>5 accuracy, а также анализируется чувствительность качества к изменению размера модели и числа активируемых экспертов.</w:t>
+      </w:r>
+    </w:p>
+    <w:p>
+      <w:pPr>
+        <w:spacing w:after="0"/>
+        <w:ind w:firstLine="709"/>
+        <w:rPr>
+          <w:lang w:val="ru-RU"/>
+        </w:rPr>
+      </w:pPr>
+      <w:r>
+        <w:rPr>
+          <w:lang w:val="ru-RU"/>
+        </w:rPr>
+        <w:t>Это даёт возможность оценить, насколько гибридная MoE</w:t>
+      </w:r>
       <w:r>
         <w:rPr>
           <w:lang w:val="ru-RU"/>
         </w:rPr>
         <w:noBreakHyphen/>
-        <w:t xml:space="preserve">архитектура сохраняет или улучшает точность по сравнению с плотными и классическими </w:t>
-      </w:r>
-      <w:proofErr w:type="spellStart"/>
-      <w:r>
-        <w:rPr>
-          <w:lang w:val="ru-RU"/>
-        </w:rPr>
-        <w:t>MoE</w:t>
-      </w:r>
-      <w:proofErr w:type="spellEnd"/>
+        <w:t>архитектура сохраняет или улучшает точность по сравнению с плотными и классическими MoE</w:t>
+      </w:r>
       <w:r>
         <w:rPr>
           <w:lang w:val="ru-RU"/>
@@ -5275,50 +4380,22 @@
         <w:rPr>
           <w:lang w:val="ru-RU"/>
         </w:rPr>
-        <w:t xml:space="preserve">Сравнение с базовыми моделями проводится по двум основным линиям: качество распознавания (набор целевых метрик для каждой задачи) и вычислительная эффективность (время </w:t>
-      </w:r>
-      <w:proofErr w:type="spellStart"/>
-      <w:r>
-        <w:rPr>
-          <w:lang w:val="ru-RU"/>
-        </w:rPr>
-        <w:t>инференса</w:t>
-      </w:r>
-      <w:proofErr w:type="spellEnd"/>
-      <w:r>
-        <w:rPr>
-          <w:lang w:val="ru-RU"/>
-        </w:rPr>
-        <w:t xml:space="preserve"> на единицу входа, количество операций и объём потребляемой памяти).</w:t>
-      </w:r>
-    </w:p>
-    <w:p>
-      <w:pPr>
-        <w:spacing w:after="0"/>
-        <w:ind w:firstLine="709"/>
-        <w:rPr>
-          <w:lang w:val="ru-RU"/>
-        </w:rPr>
-      </w:pPr>
-      <w:r>
-        <w:rPr>
-          <w:lang w:val="ru-RU"/>
-        </w:rPr>
-        <w:t xml:space="preserve">Отдельное внимание уделяется влиянию специализированных экспертов и модифицированного </w:t>
-      </w:r>
-      <w:proofErr w:type="spellStart"/>
-      <w:r>
-        <w:rPr>
-          <w:lang w:val="ru-RU"/>
-        </w:rPr>
-        <w:t>роутинга</w:t>
-      </w:r>
-      <w:proofErr w:type="spellEnd"/>
-      <w:r>
-        <w:rPr>
-          <w:lang w:val="ru-RU"/>
-        </w:rPr>
-        <w:t xml:space="preserve"> на результаты в каждом из доменов.</w:t>
+        <w:t>Сравнение с базовыми моделями проводится по двум основным линиям: качество распознавания (набор целевых метрик для каждой задачи) и вычислительная эффективность (время инференса на единицу входа, количество операций и объём потребляемой памяти).</w:t>
+      </w:r>
+    </w:p>
+    <w:p>
+      <w:pPr>
+        <w:spacing w:after="0"/>
+        <w:ind w:firstLine="709"/>
+        <w:rPr>
+          <w:lang w:val="ru-RU"/>
+        </w:rPr>
+      </w:pPr>
+      <w:r>
+        <w:rPr>
+          <w:lang w:val="ru-RU"/>
+        </w:rPr>
+        <w:t>Отдельное внимание уделяется влиянию специализированных экспертов и модифицированного роутинга на результаты в каждом из доменов.</w:t>
       </w:r>
     </w:p>
     <w:p>
@@ -5338,100 +4415,36 @@
           <w:lang w:val="ru-RU"/>
         </w:rPr>
         <w:lastRenderedPageBreak/>
-        <w:t xml:space="preserve">3.3. Анализ эффективности </w:t>
-      </w:r>
-      <w:proofErr w:type="spellStart"/>
-      <w:r>
-        <w:rPr>
-          <w:b/>
-          <w:bCs/>
-          <w:lang w:val="ru-RU"/>
-        </w:rPr>
-        <w:t>роутинга</w:t>
-      </w:r>
-      <w:proofErr w:type="spellEnd"/>
-      <w:r>
-        <w:rPr>
-          <w:b/>
-          <w:bCs/>
-          <w:lang w:val="ru-RU"/>
-        </w:rPr>
-        <w:t xml:space="preserve"> и балансировки нагрузки (</w:t>
-      </w:r>
-      <w:proofErr w:type="spellStart"/>
-      <w:r>
-        <w:rPr>
-          <w:b/>
-          <w:bCs/>
-          <w:lang w:val="ru-RU"/>
-        </w:rPr>
-        <w:t>ablation</w:t>
-      </w:r>
-      <w:proofErr w:type="spellEnd"/>
-      <w:r>
-        <w:rPr>
-          <w:b/>
-          <w:bCs/>
-          <w:lang w:val="ru-RU"/>
-        </w:rPr>
-        <w:t xml:space="preserve"> </w:t>
-      </w:r>
-      <w:proofErr w:type="spellStart"/>
-      <w:r>
-        <w:rPr>
-          <w:b/>
-          <w:bCs/>
-          <w:lang w:val="ru-RU"/>
-        </w:rPr>
-        <w:t>studies</w:t>
-      </w:r>
-      <w:proofErr w:type="spellEnd"/>
-      <w:r>
-        <w:rPr>
-          <w:b/>
-          <w:bCs/>
-          <w:lang w:val="ru-RU"/>
-        </w:rPr>
-        <w:t>)</w:t>
-      </w:r>
-    </w:p>
-    <w:p>
-      <w:pPr>
-        <w:spacing w:after="0"/>
-        <w:ind w:firstLine="709"/>
-        <w:rPr>
-          <w:lang w:val="ru-RU"/>
-        </w:rPr>
-      </w:pPr>
-    </w:p>
-    <w:p>
-      <w:pPr>
-        <w:spacing w:after="0"/>
-        <w:ind w:firstLine="709"/>
-        <w:rPr>
-          <w:b/>
-          <w:bCs/>
-          <w:lang w:val="ru-RU"/>
-        </w:rPr>
-      </w:pPr>
-      <w:r>
-        <w:rPr>
-          <w:b/>
-          <w:bCs/>
-          <w:lang w:val="ru-RU"/>
-        </w:rPr>
-        <w:t xml:space="preserve">Для оценки вклада отдельных элементов гибридной архитектуры проводится серия </w:t>
-      </w:r>
-      <w:proofErr w:type="spellStart"/>
-      <w:r>
-        <w:rPr>
-          <w:b/>
-          <w:bCs/>
-          <w:lang w:val="ru-RU"/>
-        </w:rPr>
-        <w:t>ablation</w:t>
-      </w:r>
-      <w:proofErr w:type="spellEnd"/>
+        <w:t>3.3. Анализ эффективности роутинга и балансировки нагрузки (ablation studies)</w:t>
+      </w:r>
+    </w:p>
+    <w:p>
+      <w:pPr>
+        <w:spacing w:after="0"/>
+        <w:ind w:firstLine="709"/>
+        <w:rPr>
+          <w:lang w:val="ru-RU"/>
+        </w:rPr>
+      </w:pPr>
+    </w:p>
+    <w:p>
+      <w:pPr>
+        <w:spacing w:after="0"/>
+        <w:ind w:firstLine="709"/>
+        <w:rPr>
+          <w:b/>
+          <w:bCs/>
+          <w:lang w:val="ru-RU"/>
+        </w:rPr>
+      </w:pPr>
+      <w:r>
+        <w:rPr>
+          <w:b/>
+          <w:bCs/>
+          <w:lang w:val="ru-RU"/>
+        </w:rPr>
+        <w:t>Для оценки вклада отдельных элементов гибридной архитектуры проводится серия ablation</w:t>
+      </w:r>
       <w:r>
         <w:rPr>
           <w:b/>
@@ -5439,25 +4452,7 @@
           <w:lang w:val="ru-RU"/>
         </w:rPr>
         <w:noBreakHyphen/>
-        <w:t xml:space="preserve">исследований, в которых поочерёдно изменяются компоненты алгоритма </w:t>
-      </w:r>
-      <w:proofErr w:type="spellStart"/>
-      <w:r>
-        <w:rPr>
-          <w:b/>
-          <w:bCs/>
-          <w:lang w:val="ru-RU"/>
-        </w:rPr>
-        <w:t>роутинга</w:t>
-      </w:r>
-      <w:proofErr w:type="spellEnd"/>
-      <w:r>
-        <w:rPr>
-          <w:b/>
-          <w:bCs/>
-          <w:lang w:val="ru-RU"/>
-        </w:rPr>
-        <w:t xml:space="preserve"> и конфигурации экспертов.</w:t>
+        <w:t>исследований, в которых поочерёдно изменяются компоненты алгоритма роутинга и конфигурации экспертов.</w:t>
       </w:r>
     </w:p>
     <w:p>
@@ -5496,16 +4491,8 @@
         <w:rPr>
           <w:lang w:val="ru-RU"/>
         </w:rPr>
-        <w:t xml:space="preserve">В другом наборе экспериментов варьируется число активируемых экспертов k и тип схемы маршрутизации (строгий </w:t>
-      </w:r>
-      <w:proofErr w:type="spellStart"/>
-      <w:r>
-        <w:rPr>
-          <w:lang w:val="ru-RU"/>
-        </w:rPr>
-        <w:t>top</w:t>
-      </w:r>
-      <w:proofErr w:type="spellEnd"/>
+        <w:t>В другом наборе экспериментов варьируется число активируемых экспертов k и тип схемы маршрутизации (строгий top</w:t>
+      </w:r>
       <w:r>
         <w:rPr>
           <w:lang w:val="ru-RU"/>
@@ -5556,21 +4543,7 @@
         <w:rPr>
           <w:lang w:val="ru-RU"/>
         </w:rPr>
-        <w:t xml:space="preserve">Это даёт возможность выявить узкие места предложенного алгоритма </w:t>
-      </w:r>
-      <w:proofErr w:type="spellStart"/>
-      <w:r>
-        <w:rPr>
-          <w:lang w:val="ru-RU"/>
-        </w:rPr>
-        <w:t>роутинга</w:t>
-      </w:r>
-      <w:proofErr w:type="spellEnd"/>
-      <w:r>
-        <w:rPr>
-          <w:lang w:val="ru-RU"/>
-        </w:rPr>
-        <w:t xml:space="preserve"> и подтвердить его способность снижать перегрузку отдельных экспертов без потери качества.</w:t>
+        <w:t>Это даёт возможность выявить узкие места предложенного алгоритма роутинга и подтвердить его способность снижать перегрузку отдельных экспертов без потери качества.</w:t>
       </w:r>
     </w:p>
     <w:p>
@@ -5599,177 +4572,59 @@
           <w:lang w:val="ru-RU"/>
         </w:rPr>
         <w:lastRenderedPageBreak/>
-        <w:t>3.4. Сравнение производительности (</w:t>
-      </w:r>
-      <w:proofErr w:type="spellStart"/>
-      <w:r>
-        <w:rPr>
-          <w:b/>
-          <w:bCs/>
-          <w:lang w:val="ru-RU"/>
-        </w:rPr>
-        <w:t>latency</w:t>
-      </w:r>
-      <w:proofErr w:type="spellEnd"/>
-      <w:r>
-        <w:rPr>
-          <w:b/>
-          <w:bCs/>
-          <w:lang w:val="ru-RU"/>
-        </w:rPr>
-        <w:t xml:space="preserve">, </w:t>
-      </w:r>
-      <w:proofErr w:type="spellStart"/>
-      <w:r>
-        <w:rPr>
-          <w:b/>
-          <w:bCs/>
-          <w:lang w:val="ru-RU"/>
-        </w:rPr>
-        <w:t>accuracy</w:t>
-      </w:r>
-      <w:proofErr w:type="spellEnd"/>
-      <w:r>
-        <w:rPr>
-          <w:b/>
-          <w:bCs/>
-          <w:lang w:val="ru-RU"/>
-        </w:rPr>
-        <w:t xml:space="preserve">) с базовыми </w:t>
-      </w:r>
-      <w:proofErr w:type="spellStart"/>
-      <w:r>
-        <w:rPr>
-          <w:b/>
-          <w:bCs/>
-          <w:lang w:val="ru-RU"/>
-        </w:rPr>
-        <w:t>MoE</w:t>
-      </w:r>
-      <w:proofErr w:type="spellEnd"/>
-      <w:r>
-        <w:rPr>
-          <w:b/>
-          <w:bCs/>
-          <w:lang w:val="ru-RU"/>
-        </w:rPr>
-        <w:t xml:space="preserve"> и монолитными моделями</w:t>
-      </w:r>
-    </w:p>
-    <w:p>
-      <w:pPr>
-        <w:spacing w:after="0"/>
-        <w:ind w:firstLine="709"/>
-        <w:rPr>
-          <w:lang w:val="ru-RU"/>
-        </w:rPr>
-      </w:pPr>
-      <w:r>
-        <w:rPr>
-          <w:lang w:val="ru-RU"/>
-        </w:rPr>
-        <w:t xml:space="preserve">Заключительный этап экспериментальной части посвящён интегральному сравнению гибридной </w:t>
-      </w:r>
-      <w:proofErr w:type="spellStart"/>
-      <w:r>
-        <w:rPr>
-          <w:lang w:val="ru-RU"/>
-        </w:rPr>
-        <w:t>MoE</w:t>
-      </w:r>
-      <w:proofErr w:type="spellEnd"/>
+        <w:t>3.4. Сравнение производительности (latency, accuracy) с базовыми MoE и монолитными моделями</w:t>
+      </w:r>
+    </w:p>
+    <w:p>
+      <w:pPr>
+        <w:spacing w:after="0"/>
+        <w:ind w:firstLine="709"/>
+        <w:rPr>
+          <w:lang w:val="ru-RU"/>
+        </w:rPr>
+      </w:pPr>
+      <w:r>
+        <w:rPr>
+          <w:lang w:val="ru-RU"/>
+        </w:rPr>
+        <w:t>Заключительный этап экспериментальной части посвящён интегральному сравнению гибридной MoE</w:t>
+      </w:r>
       <w:r>
         <w:rPr>
           <w:lang w:val="ru-RU"/>
         </w:rPr>
         <w:noBreakHyphen/>
-        <w:t xml:space="preserve">архитектуры с несколькими базовыми линиями: классическими плотными трансформерами и существующими реализациями </w:t>
-      </w:r>
-      <w:proofErr w:type="spellStart"/>
-      <w:r>
-        <w:rPr>
-          <w:lang w:val="ru-RU"/>
-        </w:rPr>
-        <w:t>MoE</w:t>
-      </w:r>
-      <w:proofErr w:type="spellEnd"/>
-      <w:r>
-        <w:rPr>
-          <w:lang w:val="ru-RU"/>
-        </w:rPr>
-        <w:t xml:space="preserve"> без доменной специализации и продвинутой балансировки.</w:t>
-      </w:r>
-    </w:p>
-    <w:p>
-      <w:pPr>
-        <w:spacing w:after="0"/>
-        <w:ind w:firstLine="709"/>
-        <w:rPr>
-          <w:lang w:val="ru-RU"/>
-        </w:rPr>
-      </w:pPr>
-      <w:r>
-        <w:rPr>
-          <w:lang w:val="ru-RU"/>
-        </w:rPr>
-        <w:t xml:space="preserve">Для каждой модели строится профиль производительности, включающий метрики качества, время </w:t>
-      </w:r>
-      <w:proofErr w:type="spellStart"/>
-      <w:r>
-        <w:rPr>
-          <w:lang w:val="ru-RU"/>
-        </w:rPr>
-        <w:t>инференса</w:t>
-      </w:r>
-      <w:proofErr w:type="spellEnd"/>
-      <w:r>
-        <w:rPr>
-          <w:lang w:val="ru-RU"/>
-        </w:rPr>
-        <w:t>, использование памяти и степень равномерности загрузки экспертов.</w:t>
-      </w:r>
-    </w:p>
-    <w:p>
-      <w:pPr>
-        <w:spacing w:after="0"/>
-        <w:ind w:firstLine="709"/>
-        <w:rPr>
-          <w:lang w:val="ru-RU"/>
-        </w:rPr>
-      </w:pPr>
-      <w:r>
-        <w:rPr>
-          <w:lang w:val="ru-RU"/>
-        </w:rPr>
-        <w:t>Сопоставление по оси «</w:t>
-      </w:r>
-      <w:proofErr w:type="spellStart"/>
-      <w:r>
-        <w:rPr>
-          <w:lang w:val="ru-RU"/>
-        </w:rPr>
-        <w:t>accuracy</w:t>
-      </w:r>
-      <w:proofErr w:type="spellEnd"/>
-      <w:r>
-        <w:rPr>
-          <w:lang w:val="ru-RU"/>
-        </w:rPr>
-        <w:t>–</w:t>
-      </w:r>
-      <w:proofErr w:type="spellStart"/>
-      <w:r>
-        <w:rPr>
-          <w:lang w:val="ru-RU"/>
-        </w:rPr>
-        <w:t>latency</w:t>
-      </w:r>
-      <w:proofErr w:type="spellEnd"/>
-      <w:r>
-        <w:rPr>
-          <w:lang w:val="ru-RU"/>
-        </w:rPr>
-        <w:t>» позволяет выявить области, в которых гибридная архитектура демонстрирует преимущество, например, достижение сопоставимого или более высокого качества при сокращённой задержке или меньшем числе активных параметров.</w:t>
+        <w:t>архитектуры с несколькими базовыми линиями: классическими плотными трансформерами и существующими реализациями MoE без доменной специализации и продвинутой балансировки.</w:t>
+      </w:r>
+    </w:p>
+    <w:p>
+      <w:pPr>
+        <w:spacing w:after="0"/>
+        <w:ind w:firstLine="709"/>
+        <w:rPr>
+          <w:lang w:val="ru-RU"/>
+        </w:rPr>
+      </w:pPr>
+      <w:r>
+        <w:rPr>
+          <w:lang w:val="ru-RU"/>
+        </w:rPr>
+        <w:t>Для каждой модели строится профиль производительности, включающий метрики качества, время инференса, использование памяти и степень равномерности загрузки экспертов.</w:t>
+      </w:r>
+    </w:p>
+    <w:p>
+      <w:pPr>
+        <w:spacing w:after="0"/>
+        <w:ind w:firstLine="709"/>
+        <w:rPr>
+          <w:lang w:val="ru-RU"/>
+        </w:rPr>
+      </w:pPr>
+      <w:r>
+        <w:rPr>
+          <w:lang w:val="ru-RU"/>
+        </w:rPr>
+        <w:t>Сопоставление по оси «accuracy–latency» позволяет выявить области, в которых гибридная архитектура демонстрирует преимущество, например, достижение сопоставимого или более высокого качества при сокращённой задержке или меньшем числе активных параметров.</w:t>
       </w:r>
     </w:p>
     <w:p>
@@ -5903,115 +4758,23 @@
         <w:rPr>
           <w:lang w:val="ru-RU"/>
         </w:rPr>
-        <w:t xml:space="preserve">Результаты экспериментальной оценки позволяют судить о том, в какой мере предложенная гибридная архитектура </w:t>
-      </w:r>
-      <w:proofErr w:type="spellStart"/>
-      <w:r>
-        <w:rPr>
-          <w:lang w:val="ru-RU"/>
-        </w:rPr>
-        <w:t>Mixture</w:t>
-      </w:r>
-      <w:proofErr w:type="spellEnd"/>
-      <w:r>
-        <w:rPr>
-          <w:lang w:val="ru-RU"/>
-        </w:rPr>
-        <w:t xml:space="preserve"> </w:t>
-      </w:r>
-      <w:proofErr w:type="spellStart"/>
-      <w:r>
-        <w:rPr>
-          <w:lang w:val="ru-RU"/>
-        </w:rPr>
-        <w:t>of</w:t>
-      </w:r>
-      <w:proofErr w:type="spellEnd"/>
-      <w:r>
-        <w:rPr>
-          <w:lang w:val="ru-RU"/>
-        </w:rPr>
-        <w:t xml:space="preserve"> </w:t>
-      </w:r>
-      <w:proofErr w:type="spellStart"/>
-      <w:r>
-        <w:rPr>
-          <w:lang w:val="ru-RU"/>
-        </w:rPr>
-        <w:t>Experts</w:t>
-      </w:r>
-      <w:proofErr w:type="spellEnd"/>
-      <w:r>
-        <w:rPr>
-          <w:lang w:val="ru-RU"/>
-        </w:rPr>
-        <w:t xml:space="preserve"> достигает поставленной цели повышения эффективности в задачах NLP и CV при ограниченном вычислительном бюджете.</w:t>
-      </w:r>
-    </w:p>
-    <w:p>
-      <w:pPr>
-        <w:spacing w:after="0"/>
-        <w:ind w:firstLine="709"/>
-        <w:rPr>
-          <w:lang w:val="ru-RU"/>
-        </w:rPr>
-      </w:pPr>
-      <w:r>
-        <w:rPr>
-          <w:lang w:val="ru-RU"/>
-        </w:rPr>
-        <w:t xml:space="preserve">Анализ метрик качества и производительности показывает, что сочетание специализированных экспертов и модифицированного </w:t>
-      </w:r>
-      <w:proofErr w:type="spellStart"/>
-      <w:r>
-        <w:rPr>
-          <w:lang w:val="ru-RU"/>
-        </w:rPr>
-        <w:t>роутинга</w:t>
-      </w:r>
-      <w:proofErr w:type="spellEnd"/>
-      <w:r>
-        <w:rPr>
-          <w:lang w:val="ru-RU"/>
-        </w:rPr>
-        <w:t xml:space="preserve"> позволяет улучшать соотношение «</w:t>
-      </w:r>
-      <w:proofErr w:type="spellStart"/>
-      <w:r>
-        <w:rPr>
-          <w:lang w:val="ru-RU"/>
-        </w:rPr>
-        <w:t>accuracy</w:t>
-      </w:r>
-      <w:proofErr w:type="spellEnd"/>
-      <w:r>
-        <w:rPr>
-          <w:lang w:val="ru-RU"/>
-        </w:rPr>
-        <w:t>–</w:t>
-      </w:r>
-      <w:proofErr w:type="spellStart"/>
-      <w:r>
-        <w:rPr>
-          <w:lang w:val="ru-RU"/>
-        </w:rPr>
-        <w:t>latency</w:t>
-      </w:r>
-      <w:proofErr w:type="spellEnd"/>
-      <w:r>
-        <w:rPr>
-          <w:lang w:val="ru-RU"/>
-        </w:rPr>
-        <w:t xml:space="preserve">» по сравнению с плотными моделями и базовыми </w:t>
-      </w:r>
-      <w:proofErr w:type="spellStart"/>
-      <w:r>
-        <w:rPr>
-          <w:lang w:val="ru-RU"/>
-        </w:rPr>
-        <w:t>MoE</w:t>
-      </w:r>
-      <w:proofErr w:type="spellEnd"/>
+        <w:t>Результаты экспериментальной оценки позволяют судить о том, в какой мере предложенная гибридная архитектура Mixture of Experts достигает поставленной цели повышения эффективности в задачах NLP и CV при ограниченном вычислительном бюджете.</w:t>
+      </w:r>
+    </w:p>
+    <w:p>
+      <w:pPr>
+        <w:spacing w:after="0"/>
+        <w:ind w:firstLine="709"/>
+        <w:rPr>
+          <w:lang w:val="ru-RU"/>
+        </w:rPr>
+      </w:pPr>
+      <w:r>
+        <w:rPr>
+          <w:lang w:val="ru-RU"/>
+        </w:rPr>
+        <w:t>Анализ метрик качества и производительности показывает, что сочетание специализированных экспертов и модифицированного роутинга позволяет улучшать соотношение «accuracy–latency» по сравнению с плотными моделями и базовыми MoE</w:t>
+      </w:r>
       <w:r>
         <w:rPr>
           <w:lang w:val="ru-RU"/>
@@ -6028,52 +4791,34 @@
           <w:lang w:val="ru-RU"/>
         </w:rPr>
       </w:pPr>
-      <w:proofErr w:type="spellStart"/>
       <w:r>
         <w:rPr>
           <w:lang w:val="ru-RU"/>
         </w:rPr>
         <w:t>Ablation</w:t>
       </w:r>
-      <w:proofErr w:type="spellEnd"/>
       <w:r>
         <w:rPr>
           <w:lang w:val="ru-RU"/>
         </w:rPr>
         <w:noBreakHyphen/>
-        <w:t xml:space="preserve">исследования подтверждают, что наибольший вклад в достигнутый эффект вносит именно комбинация доменной специализации экспертов и балансировочного компонента в алгоритме </w:t>
-      </w:r>
-      <w:proofErr w:type="spellStart"/>
-      <w:r>
-        <w:rPr>
-          <w:lang w:val="ru-RU"/>
-        </w:rPr>
-        <w:t>роутинга.</w:t>
-      </w:r>
-      <w:proofErr w:type="spellEnd"/>
-    </w:p>
-    <w:p>
-      <w:pPr>
-        <w:spacing w:after="0"/>
-        <w:ind w:firstLine="709"/>
-        <w:rPr>
-          <w:lang w:val="ru-RU"/>
-        </w:rPr>
-      </w:pPr>
-      <w:r>
-        <w:rPr>
-          <w:lang w:val="ru-RU"/>
-        </w:rPr>
-        <w:t xml:space="preserve">При отключении этих элементов наблюдается как ухудшение качества на бенчмарках, так и возрастание перегрузки отдельных экспертов, что свидетельствует о важности продуманного распределения нагрузки для масштабируемых </w:t>
-      </w:r>
-      <w:proofErr w:type="spellStart"/>
-      <w:r>
-        <w:rPr>
-          <w:lang w:val="ru-RU"/>
-        </w:rPr>
-        <w:t>MoE</w:t>
-      </w:r>
-      <w:proofErr w:type="spellEnd"/>
+        <w:t>исследования подтверждают, что наибольший вклад в достигнутый эффект вносит именно комбинация доменной специализации экспертов и балансировочного компонента в алгоритме роутинга.</w:t>
+      </w:r>
+    </w:p>
+    <w:p>
+      <w:pPr>
+        <w:spacing w:after="0"/>
+        <w:ind w:firstLine="709"/>
+        <w:rPr>
+          <w:lang w:val="ru-RU"/>
+        </w:rPr>
+      </w:pPr>
+      <w:r>
+        <w:rPr>
+          <w:lang w:val="ru-RU"/>
+        </w:rPr>
+        <w:t>При отключении этих элементов наблюдается как ухудшение качества на бенчмарках, так и возрастание перегрузки отдельных экспертов, что свидетельствует о важности продуманного распределения нагрузки для масштабируемых MoE</w:t>
+      </w:r>
       <w:r>
         <w:rPr>
           <w:lang w:val="ru-RU"/>
@@ -6102,16 +4847,8 @@
         <w:rPr>
           <w:lang w:val="ru-RU"/>
         </w:rPr>
-        <w:t xml:space="preserve"> — разработка и экспериментальная проверка гибридной </w:t>
-      </w:r>
-      <w:proofErr w:type="spellStart"/>
-      <w:r>
-        <w:rPr>
-          <w:lang w:val="ru-RU"/>
-        </w:rPr>
-        <w:t>MoE</w:t>
-      </w:r>
-      <w:proofErr w:type="spellEnd"/>
+        <w:t xml:space="preserve"> — разработка и экспериментальная проверка гибридной MoE</w:t>
+      </w:r>
       <w:r>
         <w:rPr>
           <w:lang w:val="ru-RU"/>
@@ -6215,21 +4952,7 @@
         <w:rPr>
           <w:lang w:val="ru-RU"/>
         </w:rPr>
-        <w:t xml:space="preserve">, оценка проводилась на ограниченном наборе бенчмарков (GLUE и </w:t>
-      </w:r>
-      <w:proofErr w:type="spellStart"/>
-      <w:r>
-        <w:rPr>
-          <w:lang w:val="ru-RU"/>
-        </w:rPr>
-        <w:t>ImageNet</w:t>
-      </w:r>
-      <w:proofErr w:type="spellEnd"/>
-      <w:r>
-        <w:rPr>
-          <w:lang w:val="ru-RU"/>
-        </w:rPr>
-        <w:t>), что не охватывает всего спектра возможных задач и доменов, в частности сложных мультимодальных сценариев и специализированных промышленных датасетов.</w:t>
+        <w:t>, оценка проводилась на ограниченном наборе бенчмарков (GLUE и ImageNet), что не охватывает всего спектра возможных задач и доменов, в частности сложных мультимодальных сценариев и специализированных промышленных датасетов.</w:t>
       </w:r>
     </w:p>
     <w:p>
@@ -6261,35 +4984,7 @@
         <w:rPr>
           <w:lang w:val="ru-RU"/>
         </w:rPr>
-        <w:t xml:space="preserve">, используемый алгоритм </w:t>
-      </w:r>
-      <w:proofErr w:type="spellStart"/>
-      <w:r>
-        <w:rPr>
-          <w:lang w:val="ru-RU"/>
-        </w:rPr>
-        <w:t>роутинга</w:t>
-      </w:r>
-      <w:proofErr w:type="spellEnd"/>
-      <w:r>
-        <w:rPr>
-          <w:lang w:val="ru-RU"/>
-        </w:rPr>
-        <w:t xml:space="preserve"> опирается на заранее фиксированные </w:t>
-      </w:r>
-      <w:proofErr w:type="spellStart"/>
-      <w:r>
-        <w:rPr>
-          <w:lang w:val="ru-RU"/>
-        </w:rPr>
-        <w:t>гиперпараметры</w:t>
-      </w:r>
-      <w:proofErr w:type="spellEnd"/>
-      <w:r>
-        <w:rPr>
-          <w:lang w:val="ru-RU"/>
-        </w:rPr>
-        <w:t xml:space="preserve"> (число активируемых экспертов, форма балансировочного штрафа), настройка которых может быть чувствительна к размеру модели и характеристикам данных.</w:t>
+        <w:t>, используемый алгоритм роутинга опирается на заранее фиксированные гиперпараметры (число активируемых экспертов, форма балансировочного штрафа), настройка которых может быть чувствительна к размеру модели и характеристикам данных.</w:t>
       </w:r>
     </w:p>
     <w:p>
@@ -6357,21 +5052,7 @@
           <w:lang w:val="ru-RU"/>
         </w:rPr>
         <w:noBreakHyphen/>
-        <w:t xml:space="preserve">, табличные и </w:t>
-      </w:r>
-      <w:proofErr w:type="spellStart"/>
-      <w:r>
-        <w:rPr>
-          <w:lang w:val="ru-RU"/>
-        </w:rPr>
-        <w:t>графовые</w:t>
-      </w:r>
-      <w:proofErr w:type="spellEnd"/>
-      <w:r>
-        <w:rPr>
-          <w:lang w:val="ru-RU"/>
-        </w:rPr>
-        <w:t xml:space="preserve"> данные).</w:t>
+        <w:t>, табличные и графовые данные).</w:t>
       </w:r>
     </w:p>
     <w:p>
@@ -6436,25 +5117,7 @@
           <w:bCs/>
           <w:lang w:val="ru-RU"/>
         </w:rPr>
-        <w:t xml:space="preserve">4.3. Практические рекомендации по применению оптимизированной </w:t>
-      </w:r>
-      <w:proofErr w:type="spellStart"/>
-      <w:r>
-        <w:rPr>
-          <w:b/>
-          <w:bCs/>
-          <w:lang w:val="ru-RU"/>
-        </w:rPr>
-        <w:t>MoE</w:t>
-      </w:r>
-      <w:proofErr w:type="spellEnd"/>
-      <w:r>
-        <w:rPr>
-          <w:b/>
-          <w:bCs/>
-          <w:lang w:val="ru-RU"/>
-        </w:rPr>
-        <w:t xml:space="preserve"> в многоуровневых ИИ</w:t>
+        <w:t>4.3. Практические рекомендации по применению оптимизированной MoE в многоуровневых ИИ</w:t>
       </w:r>
       <w:r>
         <w:rPr>
@@ -6478,16 +5141,8 @@
         <w:rPr>
           <w:lang w:val="ru-RU"/>
         </w:rPr>
-        <w:t xml:space="preserve">С практической точки зрения оптимизированная гибридная </w:t>
-      </w:r>
-      <w:proofErr w:type="spellStart"/>
-      <w:r>
-        <w:rPr>
-          <w:lang w:val="ru-RU"/>
-        </w:rPr>
-        <w:t>MoE</w:t>
-      </w:r>
-      <w:proofErr w:type="spellEnd"/>
+        <w:t>С практической точки зрения оптимизированная гибридная MoE</w:t>
+      </w:r>
       <w:r>
         <w:rPr>
           <w:lang w:val="ru-RU"/>
@@ -6537,44 +5192,22 @@
           <w:lang w:val="ru-RU"/>
         </w:rPr>
         <w:noBreakHyphen/>
-        <w:t xml:space="preserve">системы рекомендуется уделять особое внимание мониторингу распределения нагрузки по экспертам и параметрам </w:t>
-      </w:r>
-      <w:proofErr w:type="spellStart"/>
-      <w:r>
-        <w:rPr>
-          <w:lang w:val="ru-RU"/>
-        </w:rPr>
-        <w:t>роутинга.</w:t>
-      </w:r>
-      <w:proofErr w:type="spellEnd"/>
-    </w:p>
-    <w:p>
-      <w:pPr>
-        <w:spacing w:after="0"/>
-        <w:ind w:firstLine="709"/>
-        <w:rPr>
-          <w:lang w:val="ru-RU"/>
-        </w:rPr>
-      </w:pPr>
-      <w:r>
-        <w:rPr>
-          <w:lang w:val="ru-RU"/>
-        </w:rPr>
-        <w:t xml:space="preserve">Практически полезно внедрять механизмы телеметрии, позволяющие отслеживать степень использования экспертов, время отклика на различных типах запросов и качество на контрольных выборках, что облегчает своевременную перенастройку </w:t>
-      </w:r>
-      <w:proofErr w:type="spellStart"/>
-      <w:r>
-        <w:rPr>
-          <w:lang w:val="ru-RU"/>
-        </w:rPr>
-        <w:t>гиперпараметров</w:t>
-      </w:r>
-      <w:proofErr w:type="spellEnd"/>
-      <w:r>
-        <w:rPr>
-          <w:lang w:val="ru-RU"/>
-        </w:rPr>
-        <w:t xml:space="preserve"> и предотвращает деградацию производительности.</w:t>
+        <w:t>системы рекомендуется уделять особое внимание мониторингу распределения нагрузки по экспертам и параметрам роутинга.</w:t>
+      </w:r>
+    </w:p>
+    <w:p>
+      <w:pPr>
+        <w:spacing w:after="0"/>
+        <w:ind w:firstLine="709"/>
+        <w:rPr>
+          <w:lang w:val="ru-RU"/>
+        </w:rPr>
+      </w:pPr>
+      <w:r>
+        <w:rPr>
+          <w:lang w:val="ru-RU"/>
+        </w:rPr>
+        <w:t>Практически полезно внедрять механизмы телеметрии, позволяющие отслеживать степень использования экспертов, время отклика на различных типах запросов и качество на контрольных выборках, что облегчает своевременную перенастройку гиперпараметров и предотвращает деградацию производительности.</w:t>
       </w:r>
     </w:p>
     <w:p>
@@ -6590,21 +5223,7 @@
           <w:lang w:val="ru-RU"/>
         </w:rPr>
         <w:lastRenderedPageBreak/>
-        <w:t xml:space="preserve">Дополнительно целесообразно рассматривать гибридную </w:t>
-      </w:r>
-      <w:proofErr w:type="spellStart"/>
-      <w:r>
-        <w:rPr>
-          <w:lang w:val="ru-RU"/>
-        </w:rPr>
-        <w:t>MoE</w:t>
-      </w:r>
-      <w:proofErr w:type="spellEnd"/>
-      <w:r>
-        <w:rPr>
-          <w:lang w:val="ru-RU"/>
-        </w:rPr>
-        <w:t xml:space="preserve"> как модуль, </w:t>
+        <w:t xml:space="preserve">Дополнительно целесообразно рассматривать гибридную MoE как модуль, </w:t>
       </w:r>
       <w:r>
         <w:rPr>
@@ -6616,35 +5235,7 @@
         <w:rPr>
           <w:lang w:val="ru-RU"/>
         </w:rPr>
-        <w:t xml:space="preserve"> </w:t>
-      </w:r>
-      <w:proofErr w:type="spellStart"/>
-      <w:r>
-        <w:rPr>
-          <w:lang w:val="ru-RU"/>
-        </w:rPr>
-        <w:t>selectively</w:t>
-      </w:r>
-      <w:proofErr w:type="spellEnd"/>
-      <w:r>
-        <w:rPr>
-          <w:lang w:val="ru-RU"/>
-        </w:rPr>
-        <w:t xml:space="preserve"> включён только в наиболее </w:t>
-      </w:r>
-      <w:proofErr w:type="spellStart"/>
-      <w:r>
-        <w:rPr>
-          <w:lang w:val="ru-RU"/>
-        </w:rPr>
-        <w:t>ресурсозатратные</w:t>
-      </w:r>
-      <w:proofErr w:type="spellEnd"/>
-      <w:r>
-        <w:rPr>
-          <w:lang w:val="ru-RU"/>
-        </w:rPr>
-        <w:t xml:space="preserve"> части системы, оставляя остальные компоненты в виде более простых плотных моделей.</w:t>
+        <w:t xml:space="preserve"> selectively включён только в наиболее ресурсозатратные части системы, оставляя остальные компоненты в виде более простых плотных моделей.</w:t>
       </w:r>
     </w:p>
     <w:p>
@@ -6747,223 +5338,81 @@
         <w:rPr>
           <w:lang w:val="ru-RU"/>
         </w:rPr>
-        <w:t xml:space="preserve">Выполненное исследование было посвящено анализу, разработке и экспериментальной оценке гибридной архитектуры </w:t>
-      </w:r>
-      <w:proofErr w:type="spellStart"/>
-      <w:r>
-        <w:rPr>
-          <w:lang w:val="ru-RU"/>
-        </w:rPr>
-        <w:t>Mixture</w:t>
-      </w:r>
-      <w:proofErr w:type="spellEnd"/>
-      <w:r>
-        <w:rPr>
-          <w:lang w:val="ru-RU"/>
-        </w:rPr>
-        <w:t xml:space="preserve"> </w:t>
-      </w:r>
-      <w:proofErr w:type="spellStart"/>
-      <w:r>
-        <w:rPr>
-          <w:lang w:val="ru-RU"/>
-        </w:rPr>
-        <w:t>of</w:t>
-      </w:r>
-      <w:proofErr w:type="spellEnd"/>
-      <w:r>
-        <w:rPr>
-          <w:lang w:val="ru-RU"/>
-        </w:rPr>
-        <w:t xml:space="preserve"> </w:t>
-      </w:r>
-      <w:proofErr w:type="spellStart"/>
-      <w:r>
-        <w:rPr>
-          <w:lang w:val="ru-RU"/>
-        </w:rPr>
-        <w:t>Experts</w:t>
-      </w:r>
-      <w:proofErr w:type="spellEnd"/>
-      <w:r>
-        <w:rPr>
-          <w:lang w:val="ru-RU"/>
-        </w:rPr>
-        <w:t>, ориентированной на задачи обработки естественного языка и компьютерного зрения.</w:t>
-      </w:r>
-    </w:p>
-    <w:p>
-      <w:pPr>
-        <w:spacing w:after="0"/>
-        <w:ind w:firstLine="709"/>
-        <w:rPr>
-          <w:lang w:val="ru-RU"/>
-        </w:rPr>
-      </w:pPr>
-      <w:r>
-        <w:rPr>
-          <w:lang w:val="ru-RU"/>
-        </w:rPr>
-        <w:t xml:space="preserve">На основе обзора существующих </w:t>
-      </w:r>
-      <w:proofErr w:type="spellStart"/>
-      <w:r>
-        <w:rPr>
-          <w:lang w:val="ru-RU"/>
-        </w:rPr>
-        <w:t>MoE</w:t>
-      </w:r>
-      <w:proofErr w:type="spellEnd"/>
+        <w:t>Выполненное исследование было посвящено анализу, разработке и экспериментальной оценке гибридной архитектуры Mixture of Experts, ориентированной на задачи обработки естественного языка и компьютерного зрения.</w:t>
+      </w:r>
+    </w:p>
+    <w:p>
+      <w:pPr>
+        <w:spacing w:after="0"/>
+        <w:ind w:firstLine="709"/>
+        <w:rPr>
+          <w:lang w:val="ru-RU"/>
+        </w:rPr>
+      </w:pPr>
+      <w:r>
+        <w:rPr>
+          <w:lang w:val="ru-RU"/>
+        </w:rPr>
+        <w:t>На основе обзора существующих MoE</w:t>
+      </w:r>
       <w:r>
         <w:rPr>
           <w:lang w:val="ru-RU"/>
         </w:rPr>
         <w:noBreakHyphen/>
-        <w:t xml:space="preserve">подходов были выделены ключевые проблемы, связанные с </w:t>
-      </w:r>
-      <w:proofErr w:type="spellStart"/>
-      <w:r>
-        <w:rPr>
-          <w:lang w:val="ru-RU"/>
-        </w:rPr>
-        <w:t>роутингом</w:t>
-      </w:r>
-      <w:proofErr w:type="spellEnd"/>
-      <w:r>
-        <w:rPr>
-          <w:lang w:val="ru-RU"/>
-        </w:rPr>
-        <w:t xml:space="preserve"> экспертов, неравномерной загрузкой и масштабированием, что определило требования к разрабатываемой модели.</w:t>
-      </w:r>
-    </w:p>
-    <w:p>
-      <w:pPr>
-        <w:spacing w:after="0"/>
-        <w:ind w:firstLine="709"/>
-        <w:rPr>
-          <w:lang w:val="ru-RU"/>
-        </w:rPr>
-      </w:pPr>
-      <w:r>
-        <w:rPr>
-          <w:lang w:val="ru-RU"/>
-        </w:rPr>
-        <w:t xml:space="preserve">Предложенная гибридная архитектура сочетает специализированных экспертов для NLP и CV с модифицированным алгоритмом </w:t>
-      </w:r>
-      <w:proofErr w:type="spellStart"/>
-      <w:r>
-        <w:rPr>
-          <w:lang w:val="ru-RU"/>
-        </w:rPr>
-        <w:t>роутинга</w:t>
-      </w:r>
-      <w:proofErr w:type="spellEnd"/>
-      <w:r>
-        <w:rPr>
-          <w:lang w:val="ru-RU"/>
-        </w:rPr>
-        <w:t>, учитывающим как доменную принадлежность входов, так и статистику загрузки.</w:t>
-      </w:r>
-    </w:p>
-    <w:p>
-      <w:pPr>
-        <w:spacing w:after="0"/>
-        <w:ind w:firstLine="709"/>
-        <w:rPr>
-          <w:lang w:val="ru-RU"/>
-        </w:rPr>
-      </w:pPr>
-      <w:r>
-        <w:rPr>
-          <w:lang w:val="ru-RU"/>
-        </w:rPr>
-        <w:t xml:space="preserve">Экспериментальная оценка на бенчмарках GLUE и </w:t>
-      </w:r>
-      <w:proofErr w:type="spellStart"/>
-      <w:r>
-        <w:rPr>
-          <w:lang w:val="ru-RU"/>
-        </w:rPr>
-        <w:t>ImageNet</w:t>
-      </w:r>
-      <w:proofErr w:type="spellEnd"/>
-      <w:r>
-        <w:rPr>
-          <w:lang w:val="ru-RU"/>
-        </w:rPr>
-        <w:t xml:space="preserve"> показала, что подобный подход позволяет улучшать соотношение между качеством и задержкой по сравнению с базовыми плотными моделями и классическими </w:t>
-      </w:r>
-      <w:proofErr w:type="spellStart"/>
-      <w:r>
-        <w:rPr>
-          <w:lang w:val="ru-RU"/>
-        </w:rPr>
-        <w:t>MoE</w:t>
-      </w:r>
-      <w:proofErr w:type="spellEnd"/>
-      <w:r>
-        <w:rPr>
-          <w:lang w:val="ru-RU"/>
-        </w:rPr>
-        <w:t xml:space="preserve"> при сопоставимом вычислительном бюджете.</w:t>
-      </w:r>
-    </w:p>
-    <w:p>
-      <w:pPr>
-        <w:spacing w:after="0"/>
-        <w:ind w:firstLine="709"/>
-        <w:rPr>
-          <w:lang w:val="ru-RU"/>
-        </w:rPr>
-      </w:pPr>
-      <w:r>
-        <w:rPr>
-          <w:lang w:val="ru-RU"/>
-        </w:rPr>
-        <w:t xml:space="preserve">Проведённые </w:t>
-      </w:r>
-      <w:proofErr w:type="spellStart"/>
-      <w:r>
-        <w:rPr>
-          <w:lang w:val="ru-RU"/>
-        </w:rPr>
-        <w:t>ablation</w:t>
-      </w:r>
-      <w:proofErr w:type="spellEnd"/>
+        <w:t>подходов были выделены ключевые проблемы, связанные с роутингом экспертов, неравномерной загрузкой и масштабированием, что определило требования к разрабатываемой модели.</w:t>
+      </w:r>
+    </w:p>
+    <w:p>
+      <w:pPr>
+        <w:spacing w:after="0"/>
+        <w:ind w:firstLine="709"/>
+        <w:rPr>
+          <w:lang w:val="ru-RU"/>
+        </w:rPr>
+      </w:pPr>
+      <w:r>
+        <w:rPr>
+          <w:lang w:val="ru-RU"/>
+        </w:rPr>
+        <w:t>Предложенная гибридная архитектура сочетает специализированных экспертов для NLP и CV с модифицированным алгоритмом роутинга, учитывающим как доменную принадлежность входов, так и статистику загрузки.</w:t>
+      </w:r>
+    </w:p>
+    <w:p>
+      <w:pPr>
+        <w:spacing w:after="0"/>
+        <w:ind w:firstLine="709"/>
+        <w:rPr>
+          <w:lang w:val="ru-RU"/>
+        </w:rPr>
+      </w:pPr>
+      <w:r>
+        <w:rPr>
+          <w:lang w:val="ru-RU"/>
+        </w:rPr>
+        <w:t>Экспериментальная оценка на бенчмарках GLUE и ImageNet показала, что подобный подход позволяет улучшать соотношение между качеством и задержкой по сравнению с базовыми плотными моделями и классическими MoE при сопоставимом вычислительном бюджете.</w:t>
+      </w:r>
+    </w:p>
+    <w:p>
+      <w:pPr>
+        <w:spacing w:after="0"/>
+        <w:ind w:firstLine="709"/>
+        <w:rPr>
+          <w:lang w:val="ru-RU"/>
+        </w:rPr>
+      </w:pPr>
+      <w:r>
+        <w:rPr>
+          <w:lang w:val="ru-RU"/>
+        </w:rPr>
+        <w:t>Проведённые ablation</w:t>
+      </w:r>
       <w:r>
         <w:rPr>
           <w:lang w:val="ru-RU"/>
         </w:rPr>
         <w:noBreakHyphen/>
-        <w:t xml:space="preserve">исследования подтвердили значимость доменной специализации экспертов и балансировочных механизмов в </w:t>
-      </w:r>
-      <w:proofErr w:type="spellStart"/>
-      <w:r>
-        <w:rPr>
-          <w:lang w:val="ru-RU"/>
-        </w:rPr>
-        <w:t>роутинге</w:t>
-      </w:r>
-      <w:proofErr w:type="spellEnd"/>
-      <w:r>
-        <w:rPr>
-          <w:lang w:val="ru-RU"/>
-        </w:rPr>
-        <w:t xml:space="preserve">, а также выявили ограничения, связанные с чувствительностью к выбору </w:t>
-      </w:r>
-      <w:proofErr w:type="spellStart"/>
-      <w:r>
-        <w:rPr>
-          <w:lang w:val="ru-RU"/>
-        </w:rPr>
-        <w:t>гиперпараметров</w:t>
-      </w:r>
-      <w:proofErr w:type="spellEnd"/>
-      <w:r>
-        <w:rPr>
-          <w:lang w:val="ru-RU"/>
-        </w:rPr>
-        <w:t xml:space="preserve"> и узостью набора тестовых задач.</w:t>
+        <w:t>исследования подтвердили значимость доменной специализации экспертов и балансировочных механизмов в роутинге, а также выявили ограничения, связанные с чувствительностью к выбору гиперпараметров и узостью набора тестовых задач.</w:t>
       </w:r>
     </w:p>
     <w:p>
@@ -6985,16 +5434,8 @@
           <w:lang w:val="ru-RU"/>
         </w:rPr>
         <w:lastRenderedPageBreak/>
-        <w:t xml:space="preserve">схем маршрутизации и интеграцию гибридной </w:t>
-      </w:r>
-      <w:proofErr w:type="spellStart"/>
-      <w:r>
-        <w:rPr>
-          <w:lang w:val="ru-RU"/>
-        </w:rPr>
-        <w:t>MoE</w:t>
-      </w:r>
-      <w:proofErr w:type="spellEnd"/>
+        <w:t>схем маршрутизации и интеграцию гибридной MoE</w:t>
+      </w:r>
       <w:r>
         <w:rPr>
           <w:lang w:val="ru-RU"/>
@@ -7110,47 +5551,11 @@
           <w:lang w:val="ru-RU"/>
         </w:rPr>
       </w:pPr>
-      <w:proofErr w:type="spellStart"/>
-      <w:r>
-        <w:rPr>
-          <w:lang w:val="ru-RU"/>
-        </w:rPr>
-        <w:t>Shazeer</w:t>
-      </w:r>
-      <w:proofErr w:type="spellEnd"/>
-      <w:r>
-        <w:rPr>
-          <w:lang w:val="ru-RU"/>
-        </w:rPr>
-        <w:t xml:space="preserve"> N., </w:t>
-      </w:r>
-      <w:proofErr w:type="spellStart"/>
-      <w:r>
-        <w:rPr>
-          <w:lang w:val="ru-RU"/>
-        </w:rPr>
-        <w:t>Mirhoseini</w:t>
-      </w:r>
-      <w:proofErr w:type="spellEnd"/>
-      <w:r>
-        <w:rPr>
-          <w:lang w:val="ru-RU"/>
-        </w:rPr>
-        <w:t xml:space="preserve"> A., </w:t>
-      </w:r>
-      <w:proofErr w:type="spellStart"/>
-      <w:r>
-        <w:rPr>
-          <w:lang w:val="ru-RU"/>
-        </w:rPr>
-        <w:t>Maziarz</w:t>
-      </w:r>
-      <w:proofErr w:type="spellEnd"/>
-      <w:r>
-        <w:rPr>
-          <w:lang w:val="ru-RU"/>
-        </w:rPr>
-        <w:t xml:space="preserve"> K. и др. </w:t>
+      <w:r>
+        <w:rPr>
+          <w:lang w:val="ru-RU"/>
+        </w:rPr>
+        <w:t xml:space="preserve">Shazeer N., Mirhoseini A., Maziarz K. и др. </w:t>
       </w:r>
       <w:r>
         <w:t xml:space="preserve">Outrageously Large Neural Networks: The Sparsely-Gated Mixture-of-Experts Layer // arXiv.org. 2017. </w:t>
@@ -7201,47 +5606,11 @@
           <w:lang w:val="ru-RU"/>
         </w:rPr>
       </w:pPr>
-      <w:proofErr w:type="spellStart"/>
       <w:r>
         <w:rPr>
           <w:lang w:val="fr-FR"/>
         </w:rPr>
-        <w:t>Shazeer</w:t>
-      </w:r>
-      <w:proofErr w:type="spellEnd"/>
-      <w:r>
-        <w:rPr>
-          <w:lang w:val="fr-FR"/>
-        </w:rPr>
-        <w:t xml:space="preserve"> N., </w:t>
-      </w:r>
-      <w:proofErr w:type="spellStart"/>
-      <w:r>
-        <w:rPr>
-          <w:lang w:val="fr-FR"/>
-        </w:rPr>
-        <w:t>Mirhoseini</w:t>
-      </w:r>
-      <w:proofErr w:type="spellEnd"/>
-      <w:r>
-        <w:rPr>
-          <w:lang w:val="fr-FR"/>
-        </w:rPr>
-        <w:t xml:space="preserve"> A., </w:t>
-      </w:r>
-      <w:proofErr w:type="spellStart"/>
-      <w:r>
-        <w:rPr>
-          <w:lang w:val="fr-FR"/>
-        </w:rPr>
-        <w:t>Maziarz</w:t>
-      </w:r>
-      <w:proofErr w:type="spellEnd"/>
-      <w:r>
-        <w:rPr>
-          <w:lang w:val="fr-FR"/>
-        </w:rPr>
-        <w:t xml:space="preserve"> K. et al. </w:t>
+        <w:t xml:space="preserve">Shazeer N., Mirhoseini A., Maziarz K. et al. </w:t>
       </w:r>
       <w:r>
         <w:t xml:space="preserve">Outrageously Large Neural Networks: The Sparsely-Gated Mixture-of-Experts Layer // International Conference on Learning Representations (ICLR), 2017. </w:t>
@@ -7280,29 +5649,8 @@
           <w:lang w:val="ru-RU"/>
         </w:rPr>
       </w:pPr>
-      <w:proofErr w:type="spellStart"/>
-      <w:r>
-        <w:t>Fedus</w:t>
-      </w:r>
-      <w:proofErr w:type="spellEnd"/>
-      <w:r>
-        <w:t xml:space="preserve"> W., </w:t>
-      </w:r>
-      <w:proofErr w:type="spellStart"/>
-      <w:r>
-        <w:t>Zoph</w:t>
-      </w:r>
-      <w:proofErr w:type="spellEnd"/>
-      <w:r>
-        <w:t xml:space="preserve"> B., </w:t>
-      </w:r>
-      <w:proofErr w:type="spellStart"/>
-      <w:r>
-        <w:t>Shazeer</w:t>
-      </w:r>
-      <w:proofErr w:type="spellEnd"/>
-      <w:r>
-        <w:t xml:space="preserve"> N. Switch Transformers: Scaling to Trillion Parameter Models with Simple and Efficient Sparsity // Journal of Machine Learning Research. 2022. Vol. 23, Paper No. 120. URL: </w:t>
+      <w:r>
+        <w:t>Fedus W., Zoph B., Shazeer N. Switch Transformers: Scaling to Trillion Parameter Models with Simple and Efficient Sparsity // Journal of Machine Learning Research. 2022. Vol. 23, Paper No. 120. URL: </w:t>
       </w:r>
       <w:hyperlink r:id="rId14" w:tgtFrame="_blank" w:history="1">
         <w:r>
@@ -7353,29 +5701,13 @@
         </w:rPr>
       </w:pPr>
       <w:r>
-        <w:t xml:space="preserve">THE SPARSELY-GATED MIXTURE-OF-EXPERTS LAYER / N. </w:t>
-      </w:r>
-      <w:proofErr w:type="spellStart"/>
-      <w:r>
-        <w:t>Shazeer</w:t>
-      </w:r>
-      <w:proofErr w:type="spellEnd"/>
-      <w:r>
-        <w:t xml:space="preserve"> et al. </w:t>
-      </w:r>
-      <w:proofErr w:type="spellStart"/>
-      <w:r>
-        <w:rPr>
-          <w:lang w:val="ru-RU"/>
-        </w:rPr>
-        <w:t>Technical</w:t>
-      </w:r>
-      <w:proofErr w:type="spellEnd"/>
-      <w:r>
-        <w:rPr>
-          <w:lang w:val="ru-RU"/>
-        </w:rPr>
-        <w:t xml:space="preserve"> Report. 2017. URL: </w:t>
+        <w:t xml:space="preserve">THE SPARSELY-GATED MIXTURE-OF-EXPERTS LAYER / N. Shazeer et al. </w:t>
+      </w:r>
+      <w:r>
+        <w:rPr>
+          <w:lang w:val="ru-RU"/>
+        </w:rPr>
+        <w:t>Technical Report. 2017. URL: </w:t>
       </w:r>
       <w:hyperlink r:id="rId15" w:tgtFrame="_blank" w:history="1">
         <w:r>
@@ -7449,15 +5781,7 @@
         </w:rPr>
       </w:pPr>
       <w:r>
-        <w:t>Mixture-of-Experts (</w:t>
-      </w:r>
-      <w:proofErr w:type="spellStart"/>
-      <w:r>
-        <w:t>MoE</w:t>
-      </w:r>
-      <w:proofErr w:type="spellEnd"/>
-      <w:r>
-        <w:t xml:space="preserve">) Architectures: 2024–2025 Overview and Trends // Rohan Paul Blog, 2025. </w:t>
+        <w:t xml:space="preserve">Mixture-of-Experts (MoE) Architectures: 2024–2025 Overview and Trends // Rohan Paul Blog, 2025. </w:t>
       </w:r>
       <w:r>
         <w:t>URL</w:t>
@@ -7501,14 +5825,12 @@
           </w:rPr>
           <w:t>.</w:t>
         </w:r>
-        <w:proofErr w:type="spellStart"/>
         <w:r>
           <w:rPr>
             <w:rStyle w:val="a4"/>
           </w:rPr>
           <w:t>rohan</w:t>
         </w:r>
-        <w:proofErr w:type="spellEnd"/>
         <w:r>
           <w:rPr>
             <w:rStyle w:val="a4"/>
@@ -7516,7 +5838,6 @@
           </w:rPr>
           <w:t>-</w:t>
         </w:r>
-        <w:proofErr w:type="spellStart"/>
         <w:r>
           <w:rPr>
             <w:rStyle w:val="a4"/>
@@ -7524,7 +5845,6 @@
           <w:lastRenderedPageBreak/>
           <w:t>paul</w:t>
         </w:r>
-        <w:proofErr w:type="spellEnd"/>
         <w:r>
           <w:rPr>
             <w:rStyle w:val="a4"/>
@@ -7597,14 +5917,12 @@
           </w:rPr>
           <w:t>-</w:t>
         </w:r>
-        <w:proofErr w:type="spellStart"/>
         <w:r>
           <w:rPr>
             <w:rStyle w:val="a4"/>
           </w:rPr>
           <w:t>moe</w:t>
         </w:r>
-        <w:proofErr w:type="spellEnd"/>
         <w:r>
           <w:rPr>
             <w:rStyle w:val="a4"/>
@@ -7645,15 +5963,7 @@
         </w:rPr>
       </w:pPr>
       <w:r>
-        <w:t xml:space="preserve">The Evolution of Mixture </w:t>
-      </w:r>
-      <w:proofErr w:type="gramStart"/>
-      <w:r>
-        <w:t>Of</w:t>
-      </w:r>
-      <w:proofErr w:type="gramEnd"/>
-      <w:r>
-        <w:t xml:space="preserve"> Experts: From Basics To Breakthroughs // Towards AI, 21.09.2024. </w:t>
+        <w:t xml:space="preserve">The Evolution of Mixture Of Experts: From Basics To Breakthroughs // Towards AI, 21.09.2024. </w:t>
       </w:r>
       <w:r>
         <w:t>URL</w:t>
@@ -7697,14 +6007,12 @@
           </w:rPr>
           <w:t>.</w:t>
         </w:r>
-        <w:proofErr w:type="spellStart"/>
         <w:r>
           <w:rPr>
             <w:rStyle w:val="a4"/>
           </w:rPr>
           <w:t>towardsai</w:t>
         </w:r>
-        <w:proofErr w:type="spellEnd"/>
         <w:r>
           <w:rPr>
             <w:rStyle w:val="a4"/>
@@ -7881,14 +6189,12 @@
           </w:rPr>
           <w:t>85</w:t>
         </w:r>
-        <w:proofErr w:type="spellStart"/>
         <w:r>
           <w:rPr>
             <w:rStyle w:val="a4"/>
           </w:rPr>
           <w:t>fd</w:t>
         </w:r>
-        <w:proofErr w:type="spellEnd"/>
         <w:r>
           <w:rPr>
             <w:rStyle w:val="a4"/>

</xml_diff>